<commit_message>
Paper: remove the contributions paragraph from the introduction
Co-Authored-By: Claude Opus 5.5 <noreply@anthropic.com>
Claude-Session: https://claude.ai/code/session_01P5WKk5nc81fkikewAQtiCp
</commit_message>
<xml_diff>
--- a/paper/Packet_Loss_IEEE_Paper.docx
+++ b/paper/Packet_Loss_IEEE_Paper.docx
@@ -180,22 +180,6 @@
           <w:sz w:val="20"/>
         </w:rPr>
         <w:t xml:space="preserve">We set out to measure how badly the independence assumption breaks, which standard tests can detect it, and what it does to the interval estimates people report for the loss rate. The project has two phases. This report covers Phase 1, a simulation study. Because we chose the true parameters of each network ourselves, we can check every estimate and every test against the right answer before trusting the same code on real data. Phase 2 will run that code on real captures.</w:t>
-      </w:r>
-    </w:p>
-    <w:p>
-      <w:pPr>
-        <w:pStyle w:val="BodyText"/>
-        <w:spacing w:before="0" w:after="0" w:line="240" w:lineRule="auto"/>
-        <w:ind w:firstLine="202"/>
-        <w:jc w:val="both"/>
-      </w:pPr>
-      <w:r>
-        <w:rPr>
-          <w:rFonts w:ascii="Times New Roman" w:hAnsi="Times New Roman" w:cs="Times New Roman" w:eastAsia="Times New Roman"/>
-          <w:color w:val="000000"/>
-          <w:sz w:val="20"/>
-        </w:rPr>
-        <w:t xml:space="preserve">Concretely, we fit two models to the per-second loss counts (Poisson and Negative Binomial) and two to the gaps between losses (exponential and a two-phase mixture). We test independence with a runs test and a Markov-chain likelihood-ratio test, and we estimate burst behaviour with a Bayesian model. Finally, we use simulation to check how often the usual 95% interval actually works, and how long a real capture needs to be.</w:t>
       </w:r>
     </w:p>
     <w:p>

</xml_diff>

<commit_message>
Paper: second plain-language rewrite of all prose
Co-Authored-By: Claude Opus 5.5 <noreply@anthropic.com>
Claude-Session: https://claude.ai/code/session_01P5WKk5nc81fkikewAQtiCp
</commit_message>
<xml_diff>
--- a/paper/Packet_Loss_IEEE_Paper.docx
+++ b/paper/Packet_Loss_IEEE_Paper.docx
@@ -65,7 +65,7 @@
           <w:color w:val="000000"/>
           <w:sz w:val="18"/>
         </w:rPr>
-        <w:t>A network’s loss rate is usually quoted as a single number, and most simple models treat each lost packet as an independent event. If that were true, losses per second would follow a Poisson distribution and the gaps between losses would be exponential. We wanted to see how well this holds up when losses come in bursts. We simulated three kinds of network (wired broadband, campus Wi-Fi and a mobile hotspot) with a two-state Gilbert-Elliott model, sending 50 packets per second for 1 hour on each, so 180,000 packets per network. We then fitted count and waiting-time models, tested whether consecutive packets are independent, and estimated loss rates with a Bayesian Beta-Binomial model. The independence assumption failed on every network. The variance of losses per second was 1.59, 5.31, 10.17 times the mean, where Poisson predicts 1, and a single loss made the next one 31 to 43 times more likely. This matters in practice: across 2,000 simulated captures, the usual 95% interval for the loss rate caught the true value only 40.3% to 85.7% of the time. Shrinking the sample size by a design effect brought coverage back to 93.3% to 94.0%. A power study tells us to record at least ten minutes per network when we move on to real measurements.</w:t>
+        <w:t>Loss rate is normally reported as one number, and the easiest models treat every lost packet as if it had nothing to do with the packets around it. Under that view, losses per second are Poisson and the waiting time between losses is exponential. We wanted to know what happens to these results when losses come in bursts instead. To find out, we simulated three networks (wired broadband, campus Wi-Fi and a mobile hotspot) using a two-state Gilbert-Elliott model, with each one sending 50 packets a second for 1 hour, or 180,000 packets in all. On these traces we fitted models for the counts and for the gaps, tested whether neighbouring packets are independent, and estimated loss rates with a Beta-Binomial model. Independence broke down on all three. The variance of the per-second count came out at 1.59, 5.31, 10.17 times the mean (Poisson would give 1), and once a packet was lost, the next one was 31 to 43 times more likely to go too. The practical cost showed up in the error bars. In 2,000 simulated captures, the usual 95% interval for the loss rate held the true value only 40.3% to 85.7% of the time. Cutting the sample size down by a design effect brought that back up to 93.3% to 94.0%. A power study suggests recording at least ten minutes on each network once we start taking real measurements.</w:t>
       </w:r>
     </w:p>
     <w:bookmarkStart w:id="20" w:name="keywords"/>
@@ -126,7 +126,7 @@
           <w:color w:val="000000"/>
           <w:sz w:val="20"/>
         </w:rPr>
-        <w:t xml:space="preserve">Anyone who has been on a video call over a weak Wi-Fi connection knows what packet loss feels like. The picture freezes for a moment, the voice drops a word, and then everything carries on. Behind this, the call is sending small packets at a steady rate, and some of them never arrive. The share that goes missing is the loss rate. It is the number that appears in service agreements, and it is what protocol designers use when they set retransmission timers or decide how much error correction to add.</w:t>
+        <w:t xml:space="preserve">Most of us have run into packet loss without giving it a name. A video call on bad Wi-Fi stalls for a second, a word goes missing from the audio, and then things pick up again. What is happening underneath is simple enough. The app sends small packets at a steady rate and a few of them never make it. The fraction that goes missing is the loss rate. It shows up in service agreements, and it is what protocol designers look at when they tune retransmission timers or pick how much error correction to add.</w:t>
       </w:r>
     </w:p>
     <w:p>
@@ -142,7 +142,7 @@
           <w:color w:val="000000"/>
           <w:sz w:val="20"/>
         </w:rPr>
-        <w:t xml:space="preserve">The trouble is that the loss rate only tells you how many packets were lost, not when. Ten lost packets spread over a minute are barely noticeable, because the decoder can patch over a single gap. Ten lost packets in a row are a visible freeze. Most textbook treatments get around this by assuming that every packet is lost independently, with the same small probability</w:t>
+        <w:t xml:space="preserve">The catch is that a loss rate says how many packets were lost but not when. Lose ten packets scattered across a minute and the decoder quietly fills each hole; nobody notices. Lose ten in a row and the picture freezes. The standard textbook move is to assume that every packet is lost on its own, with the same small probability</w:t>
       </w:r>
       <w:r>
         <w:rPr>
@@ -163,7 +163,7 @@
           <w:color w:val="000000"/>
           <w:sz w:val="20"/>
         </w:rPr>
-        <w:t xml:space="preserve">. That assumption is convenient. It makes the number of losses in a short window Binomial, which is very close to Poisson, and it makes the time between losses exponential. If losses actually cluster together, both of these results stop being true, and so do the error bars that are built on them.</w:t>
+        <w:t xml:space="preserve">. It is a convenient assumption because it hands you two clean results: the number of losses in a short window is Binomial (so close to Poisson), and the time between losses is exponential. If losses cluster, neither result holds, and any error bars built on top of them are off as well.</w:t>
       </w:r>
     </w:p>
     <w:p>
@@ -179,7 +179,7 @@
           <w:color w:val="000000"/>
           <w:sz w:val="20"/>
         </w:rPr>
-        <w:t xml:space="preserve">We set out to measure how badly the independence assumption breaks, which standard tests can detect it, and what it does to the interval estimates people report for the loss rate. The project has two phases. This report covers Phase 1, a simulation study. Because we chose the true parameters of each network ourselves, we can check every estimate and every test against the right answer before trusting the same code on real data. Phase 2 will run that code on real captures.</w:t>
+        <w:t xml:space="preserve">So we asked three things. How far does independence actually break? Which of the usual tests notice? And what happens to the interval people quote for the loss rate? The work is planned in two phases, and this report is about the first one, a simulation study. Since we picked every network’s true parameters ourselves, we always know the right answer, which lets us check each estimate and each test before we point the same code at real data in Phase 2.</w:t>
       </w:r>
     </w:p>
     <w:p>
@@ -195,7 +195,7 @@
           <w:color w:val="000000"/>
           <w:sz w:val="20"/>
         </w:rPr>
-        <w:t xml:space="preserve">The rest of the report runs as follows. Section II gives the background, Section III describes the loss model and how the data were generated, Section IV explains the statistical methods, and Section V presents the results. Section VI discusses what the results mean and where the study falls short, and Section VII sums up.</w:t>
+        <w:t xml:space="preserve">Section II gives some background. Section III describes the loss model and how we generated the data, Section IV goes through the statistical methods, and Section V has the results. We discuss what they mean, and where the study falls short, in Section VI, and wrap up in Section VII.</w:t>
       </w:r>
     </w:p>
     <w:bookmarkEnd w:id="21"/>
@@ -228,7 +228,7 @@
           <w:color w:val="000000"/>
           <w:sz w:val="20"/>
         </w:rPr>
-        <w:t xml:space="preserve">The idea of modelling bursty errors with a hidden two-state chain goes back to E. N. Gilbert’s work on telephone lines in 1960. E. O. Elliott extended it in 1963 so that errors could happen in both states, and the Gilbert-Elliott model is still the usual first choice for describing bursty loss.</w:t>
+        <w:t xml:space="preserve">Using a hidden two-state chain for bursty errors is an old idea. E. N. Gilbert proposed it in 1960 for errors on telephone lines, and E. O. Elliott generalised it in 1963 so that either state could produce errors. More than sixty years later, the Gilbert-Elliott model is still where most people start when they want to describe bursty loss.</w:t>
       </w:r>
     </w:p>
     <w:p>
@@ -244,7 +244,7 @@
           <w:color w:val="000000"/>
           <w:sz w:val="20"/>
         </w:rPr>
-        <w:t xml:space="preserve">It has also been known for a long time that Internet losses are not independent. Measurement studies in the 1990s found that probe packets sent close together tend to be lost together, that loss in TCP transfers comes in correlated episodes, and that Markov chains describe the time pattern of loss in multicast traces quite well. Later work fitted Gilbert models to voice traffic and linked the length of a burst to how bad a call sounds.</w:t>
+        <w:t xml:space="preserve">Nor is it news that Internet losses are not independent. Measurement work in the 1990s found that probe packets sent close together were often lost together, that TCP transfers lost packets in correlated episodes, and that Markov chains did a decent job of describing loss timing in multicast traces. Later studies fitted Gilbert models to voice traffic and tied burst length to how bad a call sounds.</w:t>
       </w:r>
     </w:p>
     <w:p>
@@ -260,7 +260,7 @@
           <w:color w:val="000000"/>
           <w:sz w:val="20"/>
         </w:rPr>
-        <w:t xml:space="preserve">Most of that work is about describing the loss process itself. Our angle is more statistical. We want to know which standard tests pick up the dependence, how much data they need to do it, and how far ordinary interval estimates drift when the dependence is ignored. For the last question we borrow the idea of a design effect from survey sampling, where it is used to correct for people being sampled in clusters rather than one at a time.</w:t>
+        <w:t xml:space="preserve">That earlier work mostly set out to describe the loss process. We come at it from the statistics side instead. Which standard tests pick up the dependence, how much data do they need, and how far off are the usual intervals if you ignore it? For that last question we borrowed the design effect from survey sampling. There it is used when people are sampled in clusters, say whole households, rather than one by one, which turns out to be a close match for packets lost in bursts.</w:t>
       </w:r>
     </w:p>
     <w:bookmarkEnd w:id="22"/>
@@ -309,7 +309,7 @@
           <w:color w:val="000000"/>
           <w:sz w:val="20"/>
         </w:rPr>
-        <w:t xml:space="preserve">Think of the network as having two moods, Good (G) and Bad (B). We cannot see the mood directly, only its effect. Before each packet, the channel moves from Good to Bad with probability</w:t>
+        <w:t xml:space="preserve">It helps to think of the network as having two moods, Good (G) and Bad (B). We never see the mood itself, only what it does to the packets. Before each packet the channel can switch: Good to Bad with probability</w:t>
       </w:r>
       <w:r>
         <w:rPr>
@@ -330,7 +330,7 @@
           <w:color w:val="000000"/>
           <w:sz w:val="20"/>
         </w:rPr>
-        <w:t xml:space="preserve">, and from Bad back to Good with probability</w:t>
+        <w:t xml:space="preserve">, Bad to Good with probability</w:t>
       </w:r>
       <w:r>
         <w:rPr>
@@ -351,7 +351,7 @@
           <w:color w:val="000000"/>
           <w:sz w:val="20"/>
         </w:rPr>
-        <w:t xml:space="preserve">. A packet is lost with a small probability</w:t>
+        <w:t xml:space="preserve">. In Good, a packet is lost with a small probability</w:t>
       </w:r>
       <w:r>
         <w:rPr>
@@ -381,15 +381,7 @@
           <w:color w:val="000000"/>
           <w:sz w:val="20"/>
         </w:rPr>
-        <w:t xml:space="preserve"> </w:t>
-      </w:r>
-      <w:r>
-        <w:rPr>
-          <w:rFonts w:ascii="Times New Roman" w:hAnsi="Times New Roman" w:cs="Times New Roman" w:eastAsia="Times New Roman"/>
-          <w:color w:val="000000"/>
-          <w:sz w:val="20"/>
-        </w:rPr>
-        <w:t xml:space="preserve">in the Good state and a much larger probability</w:t>
+        <w:t xml:space="preserve">. In Bad, the loss probability</w:t>
       </w:r>
       <w:r>
         <w:rPr>
@@ -427,7 +419,7 @@
           <w:color w:val="000000"/>
           <w:sz w:val="20"/>
         </w:rPr>
-        <w:t xml:space="preserve">in the Bad state. In the long run, the flow into Bad has to match the flow out of it, which gives the share of time spent in Bad and the overall loss rate:</w:t>
+        <w:t xml:space="preserve">is much higher. Over a long run, the channel has to enter Bad as often as it leaves, and that balance gives the share of time spent in Bad and, from it, the overall loss rate:</w:t>
       </w:r>
     </w:p>
     <w:p>
@@ -629,7 +621,7 @@
           <w:color w:val="000000"/>
           <w:sz w:val="20"/>
         </w:rPr>
-        <w:t xml:space="preserve">Each stay in a state lasts a geometric number of packets. The average stay is</w:t>
+        <w:t xml:space="preserve">How long the channel stays in a state is geometric, with an average of</w:t>
       </w:r>
       <w:r>
         <w:rPr>
@@ -705,7 +697,7 @@
           <w:color w:val="000000"/>
           <w:sz w:val="20"/>
         </w:rPr>
-        <w:t xml:space="preserve">in Bad. A burst of losses happens when the channel slips into Bad for a few packets.</w:t>
+        <w:t xml:space="preserve">in Bad. A burst is just what happens when the channel drops into Bad for a handful of packets.</w:t>
       </w:r>
     </w:p>
     <w:bookmarkEnd w:id="23"/>
@@ -738,7 +730,7 @@
           <w:color w:val="000000"/>
           <w:sz w:val="20"/>
         </w:rPr>
-        <w:t xml:space="preserve">Table I lists the parameters for our three networks. We picked them to give a low, a medium and a high loss rate, with the Bad spells getting longer as the network gets worse. Each network sends a steady 50 packets per second, one every 20 ms, which is roughly what a voice call does. We run each one for 3</w:t>
+        <w:t xml:space="preserve">Table I gives the parameters of our three networks. We chose them to cover a low, a middle and a high loss rate, and we let the Bad spells get longer as the network gets worse, since that is roughly what you would expect on a real link. Every network sends 50 packets a second, one every 20 ms, which is about what a voice call does, and we run each for 3</w:t>
       </w:r>
       <w:r>
         <w:rPr>
@@ -754,7 +746,7 @@
           <w:color w:val="000000"/>
           <w:sz w:val="20"/>
         </w:rPr>
-        <w:t xml:space="preserve">600 s, giving 180</w:t>
+        <w:t xml:space="preserve">600 s. That works out to 180</w:t>
       </w:r>
       <w:r>
         <w:rPr>
@@ -786,7 +778,7 @@
           <w:color w:val="000000"/>
           <w:sz w:val="20"/>
         </w:rPr>
-        <w:t xml:space="preserve">000 in total. Every random number comes from the seed 2026, so anyone can rerun the code and get exactly the numbers in this report.</w:t>
+        <w:t xml:space="preserve">000 overall. All the randomness comes from one seed, 2026, so rerunning the code gives back exactly the numbers in this report.</w:t>
       </w:r>
     </w:p>
     <w:p>
@@ -1777,7 +1769,7 @@
           <w:color w:val="000000"/>
           <w:sz w:val="20"/>
         </w:rPr>
-        <w:t xml:space="preserve">Stepping the chain forward one packet at a time works, but it is slow. Instead, we draw how long each stay in Good or Bad lasts straight from the geometric distribution, lay these stays end to end, and then decide for each packet whether it was lost, using the loss probability of the state it fell in. This gives exactly the same process, much faster. From each trace we pull out four things: the number of losses in each 1-s window (3</w:t>
+        <w:t xml:space="preserve">The obvious way to simulate the chain is to step it forward one packet at a time. That works, but it is slow. What we do instead is draw the length of each Good or Bad stay straight from the geometric distribution, place the stays one after another, and only then go through the packets and decide which were lost, using the loss probability of whichever state each packet landed in. The process is exactly the same; it just runs much faster. From every trace we take out four things: the loss count in each 1-s window (3</w:t>
       </w:r>
       <w:r>
         <w:rPr>
@@ -1793,7 +1785,7 @@
           <w:color w:val="000000"/>
           <w:sz w:val="20"/>
         </w:rPr>
-        <w:t xml:space="preserve">600 counts per network), the gaps between losses, the lengths of bursts (runs of back-to-back losses), and how often a delivered (N) or lost (L) packet is followed by each kind of packet. Fig. 1 shows the first few minutes of each trace. Even by eye, the Wi-Fi and mobile losses clearly come in clumps.</w:t>
+        <w:t xml:space="preserve">600 per network), the gaps between losses, the burst lengths (runs of back-to-back losses), and how often a delivered (N) or a lost (L) packet is followed by each kind. Fig. 1 plots the first few minutes. You do not need any statistics to see that Wi-Fi and mobile losses come in clumps.</w:t>
       </w:r>
     </w:p>
     <w:p>
@@ -1913,7 +1905,7 @@
           <w:color w:val="000000"/>
           <w:sz w:val="20"/>
         </w:rPr>
-        <w:t xml:space="preserve">For the loss counts per window,</w:t>
+        <w:t xml:space="preserve">For the per-window loss counts</w:t>
       </w:r>
       <w:r>
         <w:rPr>
@@ -1973,7 +1965,7 @@
           <w:color w:val="000000"/>
           <w:sz w:val="20"/>
         </w:rPr>
-        <w:t xml:space="preserve">, we start with the Poisson distribution. Its maximum-likelihood estimate is simply the average count,</w:t>
+        <w:t xml:space="preserve">, the natural first model is a Poisson, and its maximum-likelihood estimate is just the average count,</w:t>
       </w:r>
       <w:r>
         <w:rPr>
@@ -2017,7 +2009,7 @@
           <w:color w:val="000000"/>
           <w:sz w:val="20"/>
         </w:rPr>
-        <w:t xml:space="preserve">. The obvious alternative is the Negative Binomial:</w:t>
+        <w:t xml:space="preserve">. The natural second model is the Negative Binomial:</w:t>
       </w:r>
     </w:p>
     <w:p>
@@ -2310,7 +2302,7 @@
           <w:color w:val="000000"/>
           <w:sz w:val="20"/>
         </w:rPr>
-        <w:t xml:space="preserve">One way to picture the Negative Binomial is as a Poisson whose rate keeps changing, which is exactly what happens when a network flips between good and bad periods. The extra term</w:t>
+        <w:t xml:space="preserve">A handy way to think of the Negative Binomial is as a Poisson whose rate does not sit still, which is what you get when a network keeps switching between good and bad stretches. The</w:t>
       </w:r>
       <w:r>
         <w:rPr>
@@ -2372,7 +2364,7 @@
           <w:color w:val="000000"/>
           <w:sz w:val="20"/>
         </w:rPr>
-        <w:t xml:space="preserve">lets the variance be bigger than the mean, which a Poisson cannot do. We fit it by keeping the mean at</w:t>
+        <w:t xml:space="preserve">term is what lets the variance climb above the mean, something a Poisson simply cannot do. We fit it by fixing the mean at</w:t>
       </w:r>
       <w:r>
         <w:rPr>
@@ -2408,7 +2400,7 @@
           <w:color w:val="000000"/>
           <w:sz w:val="20"/>
         </w:rPr>
-        <w:t xml:space="preserve">and searching for the</w:t>
+        <w:t xml:space="preserve">and searching over</w:t>
       </w:r>
       <w:r>
         <w:rPr>
@@ -2452,7 +2444,7 @@
           <w:color w:val="000000"/>
           <w:sz w:val="20"/>
         </w:rPr>
-        <w:t xml:space="preserve">that maximises the likelihood.</w:t>
+        <w:t xml:space="preserve">for the highest likelihood.</w:t>
       </w:r>
     </w:p>
     <w:p>
@@ -2468,7 +2460,7 @@
           <w:color w:val="000000"/>
           <w:sz w:val="20"/>
         </w:rPr>
-        <w:t xml:space="preserve">For the gaps between losses, the starting point is the exponential distribution, with</w:t>
+        <w:t xml:space="preserve">For the gaps between losses, the exponential is the natural first model, with</w:t>
       </w:r>
       <w:r>
         <w:rPr>
@@ -2521,7 +2513,7 @@
           <w:color w:val="000000"/>
           <w:sz w:val="20"/>
         </w:rPr>
-        <w:t xml:space="preserve">. The alternative is a mixture of two exponentials, called a two-phase hyperexponential:</w:t>
+        <w:t xml:space="preserve">. Our alternative mixes two exponentials together, which is known as a two-phase hyperexponential:</w:t>
       </w:r>
     </w:p>
     <w:p>
@@ -2704,7 +2696,7 @@
           <w:color w:val="000000"/>
           <w:sz w:val="20"/>
         </w:rPr>
-        <w:t xml:space="preserve">The idea is that there are two kinds of gap. Short ones, with the fast rate</w:t>
+        <w:t xml:space="preserve">The thinking behind it is that gaps come in two kinds. Short gaps, with the fast rate</w:t>
       </w:r>
       <w:r>
         <w:rPr>
@@ -2734,7 +2726,7 @@
           <w:color w:val="000000"/>
           <w:sz w:val="20"/>
         </w:rPr>
-        <w:t xml:space="preserve">, happen inside a burst. Long ones, with the slow rate</w:t>
+        <w:t xml:space="preserve">, fall inside a burst. Long gaps, with the slow rate</w:t>
       </w:r>
       <w:r>
         <w:rPr>
@@ -2764,7 +2756,7 @@
           <w:color w:val="000000"/>
           <w:sz w:val="20"/>
         </w:rPr>
-        <w:t xml:space="preserve">, happen between bursts. We never know which kind a given gap is, so we fit the mixture with the Expectation-Maximisation (EM) algorithm. In each round, the E-step works out how likely each gap is to be a short one, and the M-step updates</w:t>
+        <w:t xml:space="preserve">, are the quiet stretches between bursts. The problem is that no gap comes labelled, so we fit the mixture with the Expectation-Maximisation (EM) algorithm. Each round has two steps: first estimate, for every gap, how likely it is to be a short one; then refit</w:t>
       </w:r>
       <w:r>
         <w:rPr>
@@ -2861,7 +2853,7 @@
           <w:color w:val="000000"/>
           <w:sz w:val="20"/>
         </w:rPr>
-        <w:t xml:space="preserve">using those probabilities as weights. We repeat until the fit stops improving. To compare models we use the Akaike Information Criterion,</w:t>
+        <w:t xml:space="preserve">with those likelihoods as weights. We keep going until the fit stops getting better. Models are compared using the Akaike Information Criterion,</w:t>
       </w:r>
       <w:r>
         <w:rPr>
@@ -2916,7 +2908,7 @@
           <w:color w:val="000000"/>
           <w:sz w:val="20"/>
         </w:rPr>
-        <w:t xml:space="preserve">, which rewards a good fit but charges for every extra parameter. Lower is better.</w:t>
+        <w:t xml:space="preserve">. It rewards a good fit but charges a penalty for each extra parameter, and the lower score wins.</w:t>
       </w:r>
     </w:p>
     <w:bookmarkEnd w:id="30"/>
@@ -2949,7 +2941,7 @@
           <w:color w:val="000000"/>
           <w:sz w:val="20"/>
         </w:rPr>
-        <w:t xml:space="preserve">To check the count models, we compare the observed number of windows with each count against what the model expects, using the Pearson statistic</w:t>
+        <w:t xml:space="preserve">For the count models, we line up how many windows actually had each count against how many the model predicts and use the Pearson statistic</w:t>
       </w:r>
       <w:r>
         <w:rPr>
@@ -3072,7 +3064,7 @@
           <w:color w:val="000000"/>
           <w:sz w:val="20"/>
         </w:rPr>
-        <w:t xml:space="preserve">. Small expected counts in the tail make this test unreliable, so we merge tail bins until every expected count is at least 5. The degrees of freedom are the number of bins, minus one, minus the number of fitted parameters. We also run the index-of-dispersion test. If the counts are Poisson,</w:t>
+        <w:t xml:space="preserve">. The test gets shaky when expected counts are tiny, which happens in the tail, so we merge tail bins until every expected count is at least 5. Degrees of freedom are the number of bins, less one, less the number of fitted parameters. We also run the index-of-dispersion test. For Poisson counts,</w:t>
       </w:r>
       <w:r>
         <w:rPr>
@@ -3148,7 +3140,7 @@
           <w:color w:val="000000"/>
           <w:sz w:val="20"/>
         </w:rPr>
-        <w:t xml:space="preserve">follows a</w:t>
+        <w:t xml:space="preserve">follows</w:t>
       </w:r>
       <w:r>
         <w:rPr>
@@ -3192,15 +3184,7 @@
           <w:color w:val="000000"/>
           <w:sz w:val="20"/>
         </w:rPr>
-        <w:t xml:space="preserve"> </w:t>
-      </w:r>
-      <w:r>
-        <w:rPr>
-          <w:rFonts w:ascii="Times New Roman" w:hAnsi="Times New Roman" w:cs="Times New Roman" w:eastAsia="Times New Roman"/>
-          <w:color w:val="000000"/>
-          <w:sz w:val="20"/>
-        </w:rPr>
-        <w:t xml:space="preserve">distribution, so a variance much larger than the mean shows up as a very large statistic.</w:t>
+        <w:t xml:space="preserve">, so a variance well above the mean shows up as a huge statistic.</w:t>
       </w:r>
     </w:p>
     <w:p>
@@ -3216,7 +3200,7 @@
           <w:color w:val="000000"/>
           <w:sz w:val="20"/>
         </w:rPr>
-        <w:t xml:space="preserve">For the gaps, we use the Kolmogorov-Smirnov (KS) distance</w:t>
+        <w:t xml:space="preserve">For the gaps we use the Kolmogorov-Smirnov (KS) distance</w:t>
       </w:r>
       <w:r>
         <w:rPr>
@@ -3316,7 +3300,7 @@
           <w:color w:val="000000"/>
           <w:sz w:val="20"/>
         </w:rPr>
-        <w:t xml:space="preserve">, the largest vertical gap between the data’s cumulative curve and the model’s. There is a catch here. The standard KS tables assume the model was fixed before looking at the data, but we estimate the rate from the same data, which flatters the fit and makes the textbook p-value too large. To get an honest p-value we use a parametric bootstrap. We simulate a fake data set from the fitted model, refit it, and record its</w:t>
+        <w:t xml:space="preserve">, the biggest vertical gap between the data’s cumulative curve and the model’s. There is a trap here that is easy to miss. The usual KS tables assume the model was fixed before you looked at the data. We estimate the rate from the very data we are testing, which makes the fit look better than it is and the p-value too large. Our fix is a parametric bootstrap: simulate a fake data set from the fitted model, refit it, note its</w:t>
       </w:r>
       <w:r>
         <w:rPr>
@@ -3337,7 +3321,7 @@
           <w:color w:val="000000"/>
           <w:sz w:val="20"/>
         </w:rPr>
-        <w:t xml:space="preserve">. Doing this 2</w:t>
+        <w:t xml:space="preserve">, and repeat, 2</w:t>
       </w:r>
       <w:r>
         <w:rPr>
@@ -3353,7 +3337,7 @@
           <w:color w:val="000000"/>
           <w:sz w:val="20"/>
         </w:rPr>
-        <w:t xml:space="preserve">000 times for the exponential and 500 times for the mixture shows how large</w:t>
+        <w:t xml:space="preserve">000 times for the exponential and 500 for the mixture. That shows how big</w:t>
       </w:r>
       <w:r>
         <w:rPr>
@@ -3382,7 +3366,7 @@
           <w:color w:val="000000"/>
           <w:sz w:val="20"/>
         </w:rPr>
-        <w:t xml:space="preserve">normally gets when the model really is correct.</w:t>
+        <w:t xml:space="preserve">normally gets when the model really is right.</w:t>
       </w:r>
     </w:p>
     <w:bookmarkEnd w:id="31"/>
@@ -3415,7 +3399,7 @@
           <w:color w:val="000000"/>
           <w:sz w:val="20"/>
         </w:rPr>
-        <w:t xml:space="preserve">The Wald-Wolfowitz runs test looks at the 0/1 sequence of delivered and lost packets and counts the runs</w:t>
+        <w:t xml:space="preserve">The Wald-Wolfowitz runs test treats the trace as a string of 0s and 1s (delivered or lost) and counts the runs</w:t>
       </w:r>
       <w:r>
         <w:rPr>
@@ -3436,7 +3420,7 @@
           <w:color w:val="000000"/>
           <w:sz w:val="20"/>
         </w:rPr>
-        <w:t xml:space="preserve">, meaning stretches of identical outcomes. With</w:t>
+        <w:t xml:space="preserve">, the unbroken stretches of the same outcome. With</w:t>
       </w:r>
       <w:r>
         <w:rPr>
@@ -3778,7 +3762,7 @@
           <w:color w:val="000000"/>
           <w:sz w:val="20"/>
         </w:rPr>
-        <w:t xml:space="preserve">If losses stick together, there are fewer switches between lost and delivered than chance would give, so</w:t>
+        <w:t xml:space="preserve">When losses stick together, the string flips between lost and delivered less often than chance would, so</w:t>
       </w:r>
       <w:r>
         <w:rPr>
@@ -3807,7 +3791,7 @@
           <w:color w:val="000000"/>
           <w:sz w:val="20"/>
         </w:rPr>
-        <w:t xml:space="preserve">comes out too small.</w:t>
+        <w:t xml:space="preserve">comes out low.</w:t>
       </w:r>
     </w:p>
     <w:p>
@@ -3823,7 +3807,7 @@
           <w:color w:val="000000"/>
           <w:sz w:val="20"/>
         </w:rPr>
-        <w:t xml:space="preserve">The Markov-chain test asks a more direct question: does the fate of one packet depend on the packet before it? Under</w:t>
+        <w:t xml:space="preserve">The Markov-chain test gets at the question more directly. Does what happened to one packet change the odds for the next? Under</w:t>
       </w:r>
       <w:r>
         <w:rPr>
@@ -3853,15 +3837,7 @@
           <w:color w:val="000000"/>
           <w:sz w:val="20"/>
         </w:rPr>
-        <w:t xml:space="preserve"> </w:t>
-      </w:r>
-      <w:r>
-        <w:rPr>
-          <w:rFonts w:ascii="Times New Roman" w:hAnsi="Times New Roman" w:cs="Times New Roman" w:eastAsia="Times New Roman"/>
-          <w:color w:val="000000"/>
-          <w:sz w:val="20"/>
-        </w:rPr>
-        <w:t xml:space="preserve">every packet has the same loss probability. Under</w:t>
+        <w:t xml:space="preserve">, no: every packet has the same loss probability. Under</w:t>
       </w:r>
       <w:r>
         <w:rPr>
@@ -3891,15 +3867,7 @@
           <w:color w:val="000000"/>
           <w:sz w:val="20"/>
         </w:rPr>
-        <w:t xml:space="preserve"> </w:t>
-      </w:r>
-      <w:r>
-        <w:rPr>
-          <w:rFonts w:ascii="Times New Roman" w:hAnsi="Times New Roman" w:cs="Times New Roman" w:eastAsia="Times New Roman"/>
-          <w:color w:val="000000"/>
-          <w:sz w:val="20"/>
-        </w:rPr>
-        <w:t xml:space="preserve">there are two probabilities,</w:t>
+        <w:t xml:space="preserve">, yes: there is one probability after a delivered packet,</w:t>
       </w:r>
       <w:r>
         <w:rPr>
@@ -3951,15 +3919,7 @@
           <w:color w:val="000000"/>
           <w:sz w:val="20"/>
         </w:rPr>
-        <w:t xml:space="preserve"> </w:t>
-      </w:r>
-      <w:r>
-        <w:rPr>
-          <w:rFonts w:ascii="Times New Roman" w:hAnsi="Times New Roman" w:cs="Times New Roman" w:eastAsia="Times New Roman"/>
-          <w:color w:val="000000"/>
-          <w:sz w:val="20"/>
-        </w:rPr>
-        <w:t xml:space="preserve">after a delivered packet and</w:t>
+        <w:t xml:space="preserve">, and another after a lost one,</w:t>
       </w:r>
       <w:r>
         <w:rPr>
@@ -4011,15 +3971,7 @@
           <w:color w:val="000000"/>
           <w:sz w:val="20"/>
         </w:rPr>
-        <w:t xml:space="preserve"> </w:t>
-      </w:r>
-      <w:r>
-        <w:rPr>
-          <w:rFonts w:ascii="Times New Roman" w:hAnsi="Times New Roman" w:cs="Times New Roman" w:eastAsia="Times New Roman"/>
-          <w:color w:val="000000"/>
-          <w:sz w:val="20"/>
-        </w:rPr>
-        <w:t xml:space="preserve">after a lost one. If</w:t>
+        <w:t xml:space="preserve">. Writing</w:t>
       </w:r>
       <w:r>
         <w:rPr>
@@ -4060,7 +4012,7 @@
           <w:color w:val="000000"/>
           <w:sz w:val="20"/>
         </w:rPr>
-        <w:t xml:space="preserve">is the number of times outcome</w:t>
+        <w:t xml:space="preserve">for the number of times outcome</w:t>
       </w:r>
       <w:r>
         <w:rPr>
@@ -4420,7 +4372,7 @@
           <w:color w:val="000000"/>
           <w:sz w:val="20"/>
         </w:rPr>
-        <w:t xml:space="preserve">Since</w:t>
+        <w:t xml:space="preserve">Because</w:t>
       </w:r>
       <w:r>
         <w:rPr>
@@ -4458,7 +4410,7 @@
           <w:color w:val="000000"/>
           <w:sz w:val="20"/>
         </w:rPr>
-        <w:t xml:space="preserve">has one more parameter than</w:t>
+        <w:t xml:space="preserve">has one parameter more than</w:t>
       </w:r>
       <w:r>
         <w:rPr>
@@ -4488,7 +4440,7 @@
           <w:color w:val="000000"/>
           <w:sz w:val="20"/>
         </w:rPr>
-        <w:t xml:space="preserve">, Wilks’ theorem says</w:t>
+        <w:t xml:space="preserve">, Wilks’ theorem tells us</w:t>
       </w:r>
       <w:r>
         <w:rPr>
@@ -4607,7 +4559,7 @@
           <w:color w:val="000000"/>
           <w:sz w:val="20"/>
         </w:rPr>
-        <w:t xml:space="preserve">is true. The two estimates are also useful on their own. The ratio</w:t>
+        <w:t xml:space="preserve">holds. The two estimates are worth keeping for their own sake, too. The ratio</w:t>
       </w:r>
       <w:r>
         <w:rPr>
@@ -4645,7 +4597,7 @@
           <w:color w:val="000000"/>
           <w:sz w:val="20"/>
         </w:rPr>
-        <w:t xml:space="preserve">tells us how much one loss raises the chance of the next, and</w:t>
+        <w:t xml:space="preserve">says how much a loss raises the odds of another, and</w:t>
       </w:r>
       <w:r>
         <w:rPr>
@@ -4718,7 +4670,7 @@
           <w:color w:val="000000"/>
           <w:sz w:val="20"/>
         </w:rPr>
-        <w:t xml:space="preserve">To compare the three networks we use rank-based tests, because the counts are mostly zeros, heavily skewed and nothing like normal. The Kruskal-Wallis test compares all three at once, and pairwise Mann-Whitney tests compare them two at a time, with a Bonferroni correction so that running three tests does not inflate the false-alarm rate. A</w:t>
+        <w:t xml:space="preserve">To compare the three networks we stuck to rank-based tests. The counts are mostly zeros and heavily skewed, so anything that assumes normality would be on thin ice. Kruskal-Wallis compares all three together; pairwise Mann-Whitney tests compare them two at a time, with a Bonferroni correction so that running three tests does not quietly push up the false-alarm rate. A</w:t>
       </w:r>
       <w:r>
         <w:rPr>
@@ -4756,7 +4708,7 @@
           <w:color w:val="000000"/>
           <w:sz w:val="20"/>
         </w:rPr>
-        <w:t xml:space="preserve">test of homogeneity on the lost and delivered totals checks whether the loss proportion is the same everywhere. Every test uses</w:t>
+        <w:t xml:space="preserve">test of homogeneity on the lost and delivered totals checks whether the loss proportion is the same on every network. All tests use</w:t>
       </w:r>
       <w:r>
         <w:rPr>
@@ -4819,7 +4771,7 @@
           <w:color w:val="000000"/>
           <w:sz w:val="20"/>
         </w:rPr>
-        <w:t xml:space="preserve">For the loss rate itself, we take a Bayesian view. We start from a flat</w:t>
+        <w:t xml:space="preserve">For the loss rate itself we went Bayesian. We start from a flat</w:t>
       </w:r>
       <w:r>
         <w:rPr>
@@ -4874,7 +4826,7 @@
           <w:color w:val="000000"/>
           <w:sz w:val="20"/>
         </w:rPr>
-        <w:t xml:space="preserve">prior, which says every loss rate between 0 and 1 is equally plausible before we see any data. After seeing</w:t>
+        <w:t xml:space="preserve">prior, meaning that before seeing any data we treat every loss rate between 0 and 1 as equally likely. After</w:t>
       </w:r>
       <w:r>
         <w:rPr>
@@ -4932,7 +4884,7 @@
           <w:color w:val="000000"/>
           <w:sz w:val="20"/>
         </w:rPr>
-        <w:t xml:space="preserve">packets, the posterior is</w:t>
+        <w:t xml:space="preserve">packets the posterior is</w:t>
       </w:r>
       <w:r>
         <w:rPr>
@@ -5009,7 +4961,7 @@
           <w:color w:val="000000"/>
           <w:sz w:val="20"/>
         </w:rPr>
-        <w:t xml:space="preserve">. In other words, we simply add the losses and deliveries to the prior counts. We report the posterior mean and the 95% credible interval, and we show for Campus Wi-Fi how the posterior narrows as more traffic comes in. To check whether the networks really are ordered by loss rate, we draw 200</w:t>
+        <w:t xml:space="preserve">, so in practice we just add the observed losses and deliveries to the prior. We report the posterior mean with a 95% credible interval, and for Campus Wi-Fi we also show how the posterior tightens as traffic comes in. To check that the networks really are ranked by loss rate, we draw 200</w:t>
       </w:r>
       <w:r>
         <w:rPr>
@@ -5025,7 +4977,7 @@
           <w:color w:val="000000"/>
           <w:sz w:val="20"/>
         </w:rPr>
-        <w:t xml:space="preserve">000 values from each posterior and count how often Wired &lt; Wi-Fi &lt; Mobile.</w:t>
+        <w:t xml:space="preserve">000 values from each posterior and count how often Wired &lt; Wi-Fi &lt; Mobile comes out.</w:t>
       </w:r>
     </w:p>
     <w:p>
@@ -5041,65 +4993,7 @@
           <w:color w:val="000000"/>
           <w:sz w:val="20"/>
         </w:rPr>
-        <w:t xml:space="preserve">The same idea works for the burst parameters. We give</w:t>
-      </w:r>
-      <w:r>
-        <w:rPr>
-          <w:rFonts w:ascii="Times New Roman" w:hAnsi="Times New Roman" w:cs="Times New Roman" w:eastAsia="Times New Roman"/>
-          <w:color w:val="000000"/>
-          <w:sz w:val="20"/>
-        </w:rPr>
-        <w:t xml:space="preserve"> </w:t>
-      </w:r>
-      <m:oMath>
-        <m:r>
-          <m:t>a</m:t>
-        </m:r>
-      </m:oMath>
-      <w:r>
-        <w:rPr>
-          <w:rFonts w:ascii="Times New Roman" w:hAnsi="Times New Roman" w:cs="Times New Roman" w:eastAsia="Times New Roman"/>
-          <w:color w:val="000000"/>
-          <w:sz w:val="20"/>
-        </w:rPr>
-        <w:t xml:space="preserve"> </w:t>
-      </w:r>
-      <w:r>
-        <w:rPr>
-          <w:rFonts w:ascii="Times New Roman" w:hAnsi="Times New Roman" w:cs="Times New Roman" w:eastAsia="Times New Roman"/>
-          <w:color w:val="000000"/>
-          <w:sz w:val="20"/>
-        </w:rPr>
-        <w:t xml:space="preserve">and</w:t>
-      </w:r>
-      <w:r>
-        <w:rPr>
-          <w:rFonts w:ascii="Times New Roman" w:hAnsi="Times New Roman" w:cs="Times New Roman" w:eastAsia="Times New Roman"/>
-          <w:color w:val="000000"/>
-          <w:sz w:val="20"/>
-        </w:rPr>
-        <w:t xml:space="preserve"> </w:t>
-      </w:r>
-      <m:oMath>
-        <m:r>
-          <m:t>b</m:t>
-        </m:r>
-      </m:oMath>
-      <w:r>
-        <w:rPr>
-          <w:rFonts w:ascii="Times New Roman" w:hAnsi="Times New Roman" w:cs="Times New Roman" w:eastAsia="Times New Roman"/>
-          <w:color w:val="000000"/>
-          <w:sz w:val="20"/>
-        </w:rPr>
-        <w:t xml:space="preserve"> </w:t>
-      </w:r>
-      <w:r>
-        <w:rPr>
-          <w:rFonts w:ascii="Times New Roman" w:hAnsi="Times New Roman" w:cs="Times New Roman" w:eastAsia="Times New Roman"/>
-          <w:color w:val="000000"/>
-          <w:sz w:val="20"/>
-        </w:rPr>
-        <w:t xml:space="preserve">their own posteriors,</w:t>
+        <w:t xml:space="preserve">The burst parameters get the same treatment. Each has its own posterior,</w:t>
       </w:r>
       <w:r>
         <w:rPr>
@@ -5303,7 +5197,7 @@
           <w:color w:val="000000"/>
           <w:sz w:val="20"/>
         </w:rPr>
-        <w:t xml:space="preserve">, and from them get credible intervals for</w:t>
+        <w:t xml:space="preserve">, and from these we get credible intervals for</w:t>
       </w:r>
       <w:r>
         <w:rPr>
@@ -5341,7 +5235,7 @@
           <w:color w:val="000000"/>
           <w:sz w:val="20"/>
         </w:rPr>
-        <w:t xml:space="preserve">and the burst length. As a sanity check on the independent model, we also ask it to predict how often a window should contain at least 5 losses, and compare that with how often it actually does.</w:t>
+        <w:t xml:space="preserve">and for the burst length. As a sanity check on the independent model, we also ask it how often a window should hold at least 5 losses, and set that next to how often it really does.</w:t>
       </w:r>
     </w:p>
     <w:bookmarkEnd w:id="33"/>
@@ -5374,7 +5268,7 @@
           <w:color w:val="000000"/>
           <w:sz w:val="20"/>
         </w:rPr>
-        <w:t xml:space="preserve">The reason bursts cause trouble for interval estimates shows up in the variance of a sum:</w:t>
+        <w:t xml:space="preserve">Why bursts are bad news for interval estimates becomes clear from the variance of a sum:</w:t>
       </w:r>
     </w:p>
     <w:p>
@@ -5606,7 +5500,7 @@
           <w:color w:val="000000"/>
           <w:sz w:val="20"/>
         </w:rPr>
-        <w:t xml:space="preserve">If packets were independent, the covariance terms would all be zero and the variance of the loss count would be</w:t>
+        <w:t xml:space="preserve">If the packets were independent, every covariance would be zero and the variance of the loss count would be</w:t>
       </w:r>
       <w:r>
         <w:rPr>
@@ -5652,7 +5546,7 @@
           <w:color w:val="000000"/>
           <w:sz w:val="20"/>
         </w:rPr>
-        <w:t xml:space="preserve">. Inside a burst, neighbouring packets tend to share the same fate, so the covariances are positive and the real variance is larger. The standard interval ignores this and comes out too narrow.</w:t>
+        <w:t xml:space="preserve">. Inside a burst, though, neighbouring packets tend to go the same way, so the covariances are positive and the true variance is bigger. The textbook interval leaves this out, so it is too narrow.</w:t>
       </w:r>
     </w:p>
     <w:p>
@@ -5668,7 +5562,7 @@
           <w:color w:val="000000"/>
           <w:sz w:val="20"/>
         </w:rPr>
-        <w:t xml:space="preserve">To correct for it, we split each trace into blocks of</w:t>
+        <w:t xml:space="preserve">To fix it, we cut each trace into blocks of</w:t>
       </w:r>
       <w:r>
         <w:rPr>
@@ -5706,7 +5600,7 @@
           <w:color w:val="000000"/>
           <w:sz w:val="20"/>
         </w:rPr>
-        <w:t xml:space="preserve">packets (10 s) and compare the real spread of the block counts with what independence would give:</w:t>
+        <w:t xml:space="preserve">packets (10 s) and compare how much the block counts really vary with how much they would vary under independence:</w:t>
       </w:r>
     </w:p>
     <w:p>
@@ -5890,7 +5784,7 @@
           <w:color w:val="000000"/>
           <w:sz w:val="20"/>
         </w:rPr>
-        <w:t xml:space="preserve">with deff never allowed below 1. You can read</w:t>
+        <w:t xml:space="preserve">(deff is never allowed below 1.) One way to read</w:t>
       </w:r>
       <w:r>
         <w:rPr>
@@ -5932,7 +5826,7 @@
           <w:color w:val="000000"/>
           <w:sz w:val="20"/>
         </w:rPr>
-        <w:t xml:space="preserve">as the number of independent packets that our correlated packets are worth. The adjusted posterior uses these effective counts,</w:t>
+        <w:t xml:space="preserve">is as the number of independent packets that our correlated ones are worth. The adjusted posterior plugs in these effective counts,</w:t>
       </w:r>
       <w:r>
         <w:rPr>
@@ -6045,7 +5939,7 @@
           <w:color w:val="000000"/>
           <w:sz w:val="20"/>
         </w:rPr>
-        <w:t xml:space="preserve">, which gives a wider and more honest interval.</w:t>
+        <w:t xml:space="preserve">, and the interval comes out wider and more honest.</w:t>
       </w:r>
     </w:p>
     <w:bookmarkEnd w:id="34"/>
@@ -6078,7 +5972,7 @@
           <w:color w:val="000000"/>
           <w:sz w:val="20"/>
         </w:rPr>
-        <w:t xml:space="preserve">Two questions cannot be answered from a single trace, so we answer them by repeating the experiment many times. The first is power: how likely is each test to notice the bursts? For capture lengths from 15 s to 600 s, we simulate 2</w:t>
+        <w:t xml:space="preserve">Some questions cannot be settled from one trace, so we repeat the whole experiment many times. The first is power, or how likely each test is to spot the bursts. For capture lengths from 15 s up to 600 s we simulate 2</w:t>
       </w:r>
       <w:r>
         <w:rPr>
@@ -6094,7 +5988,7 @@
           <w:color w:val="000000"/>
           <w:sz w:val="20"/>
         </w:rPr>
-        <w:t xml:space="preserve">000 captures per network and count how often each test rejects independence. The second is coverage: how often does a 95% interval actually contain the true loss rate? We simulate 2</w:t>
+        <w:t xml:space="preserve">000 captures per network and count how often each test rejects independence. The second is coverage, or how often a 95% interval actually contains the true loss rate. Here we simulate 2</w:t>
       </w:r>
       <w:r>
         <w:rPr>
@@ -6110,7 +6004,7 @@
           <w:color w:val="000000"/>
           <w:sz w:val="20"/>
         </w:rPr>
-        <w:t xml:space="preserve">000 captures of 10 minutes per network, build the naive and the adjusted interval for each, and count the hits. With 2</w:t>
+        <w:t xml:space="preserve">000 captures of 10 minutes per network, build both the naive and the adjusted interval for each one, and count the hits. With 2</w:t>
       </w:r>
       <w:r>
         <w:rPr>
@@ -6126,7 +6020,7 @@
           <w:color w:val="000000"/>
           <w:sz w:val="20"/>
         </w:rPr>
-        <w:t xml:space="preserve">000 repeats, each of these proportions is accurate to within about 0.011 (one standard error).</w:t>
+        <w:t xml:space="preserve">000 repeats, each proportion is good to within about 0.011 (one standard error).</w:t>
       </w:r>
     </w:p>
     <w:bookmarkEnd w:id="35"/>
@@ -6275,7 +6169,7 @@
           <w:color w:val="000000"/>
           <w:sz w:val="20"/>
         </w:rPr>
-        <w:t xml:space="preserve">The Poisson model fails on all three networks. Table II shows why. For a Poisson distribution the variance should equal the mean, but here it is 1.59, 5.31, 10.17 times the mean, and the dispersion test gives</w:t>
+        <w:t xml:space="preserve">Poisson does not survive on any of the three networks, and Table II shows why. A Poisson count has its variance equal to its mean. Ours comes out at 1.59, 5.31, 10.17 times the mean, and the dispersion test returns</w:t>
       </w:r>
       <w:r>
         <w:rPr>
@@ -6309,7 +6203,7 @@
           <w:color w:val="000000"/>
           <w:sz w:val="20"/>
         </w:rPr>
-        <w:t xml:space="preserve">&lt; 10⁻¹⁰ every time. The Negative Binomial fits much better and has a lower AIC on every network. The biggest improvement is on Mobile, where the AIC drops from 25</w:t>
+        <w:t xml:space="preserve">&lt; 10⁻¹⁰ each time. The Negative Binomial does far better and has the lower AIC everywhere. Mobile shows the biggest gap, with the AIC falling from 25</w:t>
       </w:r>
       <w:r>
         <w:rPr>
@@ -6357,7 +6251,7 @@
           <w:color w:val="000000"/>
           <w:sz w:val="20"/>
         </w:rPr>
-        <w:t xml:space="preserve">Most of the difference sits in the tail. On Wi-Fi, the Poisson model expects about 1.98 seconds with 5 or more losses in an hour. The trace actually has 131. The Negative Binomial expects 124.2, which is close. Fig. 2 shows this on a log scale: the Poisson curve falls away almost immediately, while the real counts and the Negative Binomial carry on.</w:t>
+        <w:t xml:space="preserve">Most of the difference is in the tail. Over an hour of Wi-Fi traffic, Poisson expects roughly 1.98 seconds with 5 or more losses. The trace has 131. The Negative Binomial expects 124.2, which is close. In Fig. 2, on a log scale, the Poisson curve dives almost at once while the real counts and the Negative Binomial keep going.</w:t>
       </w:r>
     </w:p>
     <w:p>
@@ -7701,7 +7595,7 @@
           <w:color w:val="000000"/>
           <w:sz w:val="20"/>
         </w:rPr>
-        <w:t xml:space="preserve">The exponential model fails too. The bootstrap KS test rejects it on every network (Table III). The easiest way to see the problem is Fig. 3. On a log scale, an exponential survival curve is a straight line. The real curves are not. They drop steeply at the start, because many gaps are tiny, and then flatten out, because the rest are long.</w:t>
+        <w:t xml:space="preserve">The exponential does not survive either: the bootstrap KS test rejects it on every network (Table III). Fig. 3 makes the problem easy to see. Plotted on a log scale, an exponential survival curve is a straight line, and the real curves are anything but straight. They fall steeply at first, because a lot of the gaps are tiny, and then level off, because the rest are long.</w:t>
       </w:r>
     </w:p>
     <w:p>
@@ -7717,7 +7611,7 @@
           <w:color w:val="000000"/>
           <w:sz w:val="20"/>
         </w:rPr>
-        <w:t xml:space="preserve">The two-phase mixture captures this shape well. Its fast phase has an average gap of 29 to 33 ms, which is one or two packets, so these are the gaps inside a burst. Its slow phase averages 2.1 to 8.6 s, which is the quiet time between bursts. The share of gaps in the fast phase grows from 16% on Wired to 77% on Mobile, which fits the idea that the mobile link spends more of its losses in bursts. The mixture passes the KS test on Wired (</w:t>
+        <w:t xml:space="preserve">The two-phase mixture follows that shape well. Its fast phase has an average gap of 29 to 33 ms, only one or two packets, so these are the gaps inside a burst. The slow phase averages between 2.1 and 8.6 s, the quiet time between bursts. The fast phase holds 16% of the gaps on Wired but 77% on Mobile, which fits with the mobile link losing more of its packets in bursts. On Wired the mixture passes the KS test (</w:t>
       </w:r>
       <m:oMath>
         <m:r>
@@ -7739,7 +7633,7 @@
           <w:color w:val="000000"/>
           <w:sz w:val="20"/>
         </w:rPr>
-        <w:t xml:space="preserve">) and cuts the AIC sharply on all three networks. It is still rejected on Wi-Fi and Mobile, though, so it is a big improvement rather than a perfect description.</w:t>
+        <w:t xml:space="preserve">), and it brings the AIC down sharply on all three. It is still rejected on Wi-Fi and Mobile, though, so it is a big step forward rather than the whole picture.</w:t>
       </w:r>
     </w:p>
     <w:p>
@@ -8958,7 +8852,7 @@
           <w:color w:val="000000"/>
           <w:sz w:val="20"/>
         </w:rPr>
-        <w:t xml:space="preserve">Yes, strongly. Both independence tests reject</w:t>
+        <w:t xml:space="preserve">They do, and strongly. Both independence tests reject</w:t>
       </w:r>
       <w:r>
         <w:rPr>
@@ -9030,7 +8924,7 @@
           <w:color w:val="000000"/>
           <w:sz w:val="20"/>
         </w:rPr>
-        <w:t xml:space="preserve">&lt; 10⁻¹⁰ on every network (Table IV). On Wi-Fi we count 3</w:t>
+        <w:t xml:space="preserve">&lt; 10⁻¹⁰ on every network (Table IV). On Wi-Fi we counted 3</w:t>
       </w:r>
       <w:r>
         <w:rPr>
@@ -9083,7 +8977,7 @@
           <w:color w:val="000000"/>
           <w:sz w:val="20"/>
         </w:rPr>
-        <w:t xml:space="preserve">-score of -146.7. The Markov estimates make the effect easy to picture. On Wi-Fi, a packet that follows a delivered packet is lost 0.85% of the time. A packet that follows a lost packet is lost 35.4% of the time.</w:t>
+        <w:t xml:space="preserve">-score of -146.7. The Markov estimates make it easier to picture. A Wi-Fi packet that comes after a delivered packet is lost 0.85% of the time. One that comes after a lost packet is lost 35.4% of the time.</w:t>
       </w:r>
     </w:p>
     <w:p>
@@ -9099,7 +8993,7 @@
           <w:color w:val="000000"/>
           <w:sz w:val="20"/>
         </w:rPr>
-        <w:t xml:space="preserve">The posterior medians of</w:t>
+        <w:t xml:space="preserve">Across Wired, Wi-Fi and Mobile, the posterior medians of</w:t>
       </w:r>
       <w:r>
         <w:rPr>
@@ -9137,7 +9031,7 @@
           <w:color w:val="000000"/>
           <w:sz w:val="20"/>
         </w:rPr>
-        <w:t xml:space="preserve">are 43, 42, 31 for Wired, Wi-Fi and Mobile, so one loss makes the next 31 to 43 times more likely (Fig. 4). The posterior probability that b &gt; a is 1.000 on every network, so there is no real doubt about the direction of the effect. Average bursts are short, 1.12, 1.55, 2.25 packets, but they are much more common than chance would allow.</w:t>
+        <w:t xml:space="preserve">are 43, 42, 31, so a single loss makes the next one 31 to 43 times more likely (Fig. 4). The posterior probability that b &gt; a is 1.000 on every network, which leaves no real doubt about the direction. Bursts are short on average, 1.12, 1.55, 2.25 packets, but they turn up far more often than chance would allow.</w:t>
       </w:r>
     </w:p>
     <w:p>
@@ -10649,7 +10543,7 @@
           <w:color w:val="000000"/>
           <w:sz w:val="20"/>
         </w:rPr>
-        <w:t xml:space="preserve">As expected from how we set them up, the three networks are clearly different. The Kruskal-Wallis statistic is</w:t>
+        <w:t xml:space="preserve">The three networks are clearly different, which is reassuring given that we built them to be. The Kruskal-Wallis statistic is</w:t>
       </w:r>
       <w:r>
         <w:rPr>
@@ -10749,7 +10643,7 @@
           <w:color w:val="000000"/>
           <w:sz w:val="20"/>
         </w:rPr>
-        <w:t xml:space="preserve">Fig. 5 shows the Bayesian side of this. After only 10 s of Campus Wi-Fi traffic, the estimate is 3.78% [2.30%, 5.62%], which is wide. After 3</w:t>
+        <w:t xml:space="preserve">Fig. 5 shows the Bayesian estimates. After just 10 s of Campus Wi-Fi traffic the estimate is 3.78% [2.30%, 5.62%], which is wide. By 3</w:t>
       </w:r>
       <w:r>
         <w:rPr>
@@ -10765,7 +10659,7 @@
           <w:color w:val="000000"/>
           <w:sz w:val="20"/>
         </w:rPr>
-        <w:t xml:space="preserve">600 s it has tightened to 1.29% [1.24%, 1.35%].</w:t>
+        <w:t xml:space="preserve">600 s it has narrowed to 1.29% [1.24%, 1.35%].</w:t>
       </w:r>
     </w:p>
     <w:p>
@@ -10781,7 +10675,7 @@
           <w:color w:val="000000"/>
           <w:sz w:val="20"/>
         </w:rPr>
-        <w:t xml:space="preserve">The predictive check shows how badly the independent model handles heavy seconds. On Wi-Fi it says a second with at least 5 losses should happen with probability 0.00047. In the trace, it happens 0.036 of the time, roughly 77 times more often.</w:t>
+        <w:t xml:space="preserve">The predictive check shows how badly the independent model handles heavy seconds. For Wi-Fi it puts the chance of a second with 5 or more losses at 0.00047. In the trace that happens 0.036 of the time, about 77 times as often.</w:t>
       </w:r>
     </w:p>
     <w:bookmarkEnd w:id="52"/>
@@ -10814,7 +10708,7 @@
           <w:color w:val="000000"/>
           <w:sz w:val="20"/>
         </w:rPr>
-        <w:t xml:space="preserve">This is the result we think matters most. Over 2</w:t>
+        <w:t xml:space="preserve">For us this is the result that matters most. Over 2</w:t>
       </w:r>
       <w:r>
         <w:rPr>
@@ -10830,7 +10724,7 @@
           <w:color w:val="000000"/>
           <w:sz w:val="20"/>
         </w:rPr>
-        <w:t xml:space="preserve">000 simulated 10-minute captures, the naive 95% interval contained the true loss rate in only 85.7%, 60.9%, 40.3% of cases (Table V, Fig. 6). On the burstiest network it was wrong more often than it was right.</w:t>
+        <w:t xml:space="preserve">000 simulated 10-minute captures, the naive 95% interval held the true loss rate in just 85.7%, 60.9%, 40.3% of cases (Table V, Fig. 6). On the burstiest network it missed more often than it hit.</w:t>
       </w:r>
     </w:p>
     <w:p>
@@ -11002,7 +10896,7 @@
           <w:color w:val="000000"/>
           <w:sz w:val="20"/>
         </w:rPr>
-        <w:t xml:space="preserve">The design effects are 1.52, 6.43 and 12.14. On Wi-Fi, that means our 180</w:t>
+        <w:t xml:space="preserve">The design effects come out at 1.52, 6.43 and 12.14. For Wi-Fi, that means our 180</w:t>
       </w:r>
       <w:r>
         <w:rPr>
@@ -11034,7 +10928,7 @@
           <w:color w:val="000000"/>
           <w:sz w:val="20"/>
         </w:rPr>
-        <w:t xml:space="preserve">000 independent ones. Once we use these smaller effective sample sizes, coverage comes back to 93.3%, 94.0%, 94.0%, close to the 95% it should be. The price is a wider interval. On Wi-Fi the average width grows from 0.245 to 0.563 percentage points, but a wider interval that is right is more useful than a narrow one that is wrong.</w:t>
+        <w:t xml:space="preserve">000 independent ones would. Once we use these smaller effective sample sizes, coverage climbs back to 93.3%, 94.0%, 94.0%, close to the 95% it is supposed to be. The cost is a wider interval: on Wi-Fi the average width goes from 0.245 to 0.563 percentage points. We think that is a fair trade, since a narrow interval that misses the truth is not much use to anyone.</w:t>
       </w:r>
     </w:p>
     <w:p>
@@ -11050,7 +10944,7 @@
           <w:color w:val="000000"/>
           <w:sz w:val="20"/>
         </w:rPr>
-        <w:t xml:space="preserve">The full Wi-Fi trace gives a concrete example. The true loss rate is 1.184%. The naive interval, [1.241%, 1.345%], misses it completely. The adjusted interval, [1.167%, 1.431%], contains it.</w:t>
+        <w:t xml:space="preserve">The full Wi-Fi trace makes this concrete. The true loss rate there is 1.184%. The naive interval, [1.241%, 1.345%], misses it entirely; the adjusted one, [1.167%, 1.431%], does not.</w:t>
       </w:r>
     </w:p>
     <w:p>
@@ -11903,7 +11797,7 @@
           <w:color w:val="000000"/>
           <w:sz w:val="20"/>
         </w:rPr>
-        <w:t xml:space="preserve">Fig. 7 shows how the power of each test grows with the length of the capture, and Table VI gives the shortest length we tried that reaches a power of 0.8. With the runs test, the mobile network needs only 15 s and Wi-Fi 30 s. Wired needs 300 s, because its bursts are rare and short, so it takes longer to collect enough evidence. The runs test was the most powerful of the three on every network. At 600 s, every test has a power of at least 0.97 on every network, so we plan to record at least ten minutes per network in Phase 2.</w:t>
+        <w:t xml:space="preserve">Fig. 7 shows each test’s power rising as captures get longer, and Table VI lists the shortest length we tried that reaches a power of 0.8. With the runs test, Mobile needs only 15 s and Wi-Fi 30 s. Wired needs 300 s: its bursts are rare and short, so evidence builds up slowly. The runs test was the most powerful of the three on every network. At 600 s, every test reaches a power of at least 0.97 everywhere, which is why we plan to record at least ten minutes per network in Phase 2.</w:t>
       </w:r>
     </w:p>
     <w:p>
@@ -12519,7 +12413,7 @@
           <w:color w:val="000000"/>
           <w:sz w:val="20"/>
         </w:rPr>
-        <w:t xml:space="preserve">The striking thing is how little it takes. A Bad spell lasting just a few packets is enough to break every model that assumes independence. The loss rate on its own hides this completely. Mobile loses about 14 times as many packets as Wired, yet on both of them a loss makes the next loss tens of times more likely. Burstiness is a separate property of a link, and it has to be measured separately.</w:t>
+        <w:t xml:space="preserve">The striking thing is how little it takes. A Bad spell of a few packets is enough to break every model that assumes independence, and the loss rate on its own gives no hint of it. Mobile loses about 14 times as many packets as Wired, yet on both of them one loss makes the next tens of times more likely. Burstiness is its own property of a link and needs to be measured on its own.</w:t>
       </w:r>
     </w:p>
     <w:p>
@@ -12535,7 +12429,7 @@
           <w:color w:val="000000"/>
           <w:sz w:val="20"/>
         </w:rPr>
-        <w:t xml:space="preserve">The coverage results show why this matters beyond modelling. A naive interval treats every packet as a fresh piece of evidence. When packets inside a burst share the same fate, there is much less independent evidence than the packet count suggests, and the interval ends up too narrow. The effect gets worse as the network gets burstier, which is why Mobile has the lowest naive coverage. The design-effect fix is simple, needs nothing more than block counts, and brings coverage close to 95% on all three networks.</w:t>
+        <w:t xml:space="preserve">The coverage results take this past model choice. A naive interval treats every packet as a new, independent piece of evidence. When packets in a burst share the same fate, there is much less independent evidence than the packet count suggests, and the interval ends up too tight. The burstier the network, the worse this gets, which is why Mobile has the lowest naive coverage. The design-effect fix is cheap (all it needs is block counts) and brings coverage close to 95% on all three networks.</w:t>
       </w:r>
     </w:p>
     <w:p>
@@ -12551,7 +12445,7 @@
           <w:color w:val="000000"/>
           <w:sz w:val="20"/>
         </w:rPr>
-        <w:t xml:space="preserve">There are several limits to what we can claim. The biggest is that the data are simulated, and from the same kind of model that motivated the study. The tests themselves do not use this knowledge, and we only use the true parameters to judge the estimates, but real links have other effects, such as busy hours, that our model leaves out. Phase 2 is meant to address this.</w:t>
+        <w:t xml:space="preserve">There are clear limits to what we can claim. The biggest one is that the data are simulated, and from the very kind of model that motivated the study. The tests do not use this, and we only use the true parameters to judge the estimates, but real links have effects our model leaves out, busy hours being the obvious one. That is what Phase 2 is for.</w:t>
       </w:r>
     </w:p>
     <w:p>
@@ -12567,7 +12461,7 @@
           <w:color w:val="000000"/>
           <w:sz w:val="20"/>
         </w:rPr>
-        <w:t xml:space="preserve">Some smaller points are worth stating too. The dispersion test compares the counts against a Poisson, while counts out of 50 packets are really Binomial, with a variance slightly below the mean. This makes the test a little cautious, so if anything it understates burstiness. The runs and Markov tests rely on large-sample approximations. In very short captures their false-alarm rate can drift away from 5%, although it stays close to 5% for hour-long traces. The Negative Binomial and the two-phase mixture are still rejected on Wi-Fi and Mobile, so neither is the full story. The design effect depends on the block length; our 10-s blocks are much longer than any Bad spell, which should be enough. Finally, the headline numbers come from one seeded trace per network, although the Monte Carlo checks repeat the whole experiment thousands of times.</w:t>
+        <w:t xml:space="preserve">A few smaller points. The dispersion test compares the counts with a Poisson, but counts out of 50 packets are strictly Binomial, with a variance a little under the mean. That makes the test slightly conservative, so if anything it understates burstiness. The runs and Markov tests rely on large-sample approximations. In very short captures their false-alarm rate can move away from 5%, though on hour-long traces it stays close. The Negative Binomial and the two-phase mixture are both still rejected on Wi-Fi and Mobile, so neither is the full story. The design effect depends on the block length; ours is 10 s, much longer than any Bad spell, which should be enough. Last, the headline numbers come from a single seeded trace per network, although the Monte Carlo checks repeat the whole experiment thousands of times.</w:t>
       </w:r>
     </w:p>
     <w:bookmarkEnd w:id="62"/>
@@ -12600,7 +12494,7 @@
           <w:color w:val="000000"/>
           <w:sz w:val="20"/>
         </w:rPr>
-        <w:t xml:space="preserve">We tested whether packet losses behave independently on three simulated networks, and they do not. The Poisson and exponential models were rejected everywhere. Losses per second were 1.59, 5.31, 10.17 times more spread out than Poisson allows, the gaps split into short in-burst gaps and long quiet gaps, and a loss made the next one 31 to 43 times more likely. Most importantly, the usual 95% interval for the loss rate was right only 40.3% to 85.7% of the time, and dividing the sample size by the design effect raised this to 93.3% to 94.0%.</w:t>
+        <w:t xml:space="preserve">We set out to test whether packet losses on three simulated networks behave independently. They do not. Poisson and exponential models were rejected everywhere. Losses per second were 1.59, 5.31, 10.17 times more spread out than a Poisson allows, the gaps split into short in-burst gaps and long quiet ones, and one loss made the next 31 to 43 times more likely. The finding we would stress most is about the error bars: the usual 95% interval for the loss rate was right only 40.3% to 85.7% of the time, and dividing the sample size by the design effect lifted that to 93.3% to 94.0%.</w:t>
       </w:r>
     </w:p>
     <w:p>
@@ -12616,7 +12510,7 @@
           <w:color w:val="000000"/>
           <w:sz w:val="20"/>
         </w:rPr>
-        <w:t xml:space="preserve">The next step is Phase 2. We will record steady 50-packets-per-second streams on real wired, Wi-Fi and mobile links, for at least ten minutes each, and run the same code on them. After that, we would like to estimate the Gilbert-Elliott parameters directly from the real traces with the Baum-Welch algorithm, try richer models for the tail, use the Phase 1 results as priors in a hierarchical Bayesian model across networks, and compare loss at peak and off-peak hours.</w:t>
+        <w:t xml:space="preserve">Phase 2 comes next. We will record steady streams of 50 packets a second on real wired, Wi-Fi and mobile links, at least ten minutes each, and run the same code on them. After that, there are a few things we would like to try: estimating the Gilbert-Elliott parameters straight from the real traces with the Baum-Welch algorithm, fitting richer models to the tail, using the Phase 1 results as priors in a hierarchical Bayesian model that pools the networks, and comparing loss at peak and off-peak hours.</w:t>
       </w:r>
     </w:p>
     <w:bookmarkEnd w:id="63"/>
@@ -12649,7 +12543,7 @@
           <w:color w:val="000000"/>
           <w:sz w:val="20"/>
         </w:rPr>
-        <w:t xml:space="preserve">All results come from a single Python pipeline built on NumPy, SciPy and Matplotlib, run with seed 2026. Rerunning it regenerates every table and figure in this report.</w:t>
+        <w:t xml:space="preserve">Everything in this report comes from one Python pipeline, built on NumPy, SciPy and Matplotlib and run with seed 2026. Running it again reproduces every table and figure.</w:t>
       </w:r>
     </w:p>
     <w:bookmarkEnd w:id="64"/>

</xml_diff>

<commit_message>
Paper: rebuild on the team's 7-page wording, light plain-language edits, no dashes
- Prose and captions follow the team's 7-page version with light edits
- Abstract and Index Terms labels use a colon instead of IEEE's em dash
- Float placement adjusted so pages 1 to 6 are full and nothing is left blank

Co-Authored-By: Claude Opus 5.5 <noreply@anthropic.com>
Claude-Session: https://claude.ai/code/session_01P5WKk5nc81fkikewAQtiCp
</commit_message>
<xml_diff>
--- a/paper/Packet_Loss_IEEE_Paper.docx
+++ b/paper/Packet_Loss_IEEE_Paper.docx
@@ -56,7 +56,7 @@
           <w:color w:val="000000"/>
           <w:sz w:val="18"/>
         </w:rPr>
-        <w:t>Abstract—</w:t>
+        <w:t xml:space="preserve">Abstract: </w:t>
       </w:r>
       <w:r>
         <w:rPr>
@@ -65,7 +65,7 @@
           <w:color w:val="000000"/>
           <w:sz w:val="18"/>
         </w:rPr>
-        <w:t>Loss rate is normally reported as one number, and the easiest models treat every lost packet as if it had nothing to do with the packets around it. Under that view, losses per second are Poisson and the waiting time between losses is exponential. We wanted to know what happens to these results when losses come in bursts instead. To find out, we simulated three networks (wired broadband, campus Wi-Fi and a mobile hotspot) using a two-state Gilbert-Elliott model, with each one sending 50 packets a second for 1 hour, or 180,000 packets in all. On these traces we fitted models for the counts and for the gaps, tested whether neighbouring packets are independent, and estimated loss rates with a Beta-Binomial model. Independence broke down on all three. The variance of the per-second count came out at 1.59, 5.31, 10.17 times the mean (Poisson would give 1), and once a packet was lost, the next one was 31 to 43 times more likely to go too. The practical cost showed up in the error bars. In 2,000 simulated captures, the usual 95% interval for the loss rate held the true value only 40.3% to 85.7% of the time. Cutting the sample size down by a design effect brought that back up to 93.3% to 94.0%. A power study suggests recording at least ten minutes on each network once we start taking real measurements.</w:t>
+        <w:t>The loss rate of a network is usually reported as a single number, and the simplest models assume that each packet is lost independently of the others. If that held, the number of losses per second would be Poisson and the gap from one loss to the next would be exponential. In this study we check how much of this survives when losses arrive in bursts. Three networks (wired broadband, campus Wi-Fi and a mobile hotspot) were simulated with a two-state Gilbert-Elliott model, each sending 50 packets per second for 1 hour, which comes to 180,000 packets per network. We fitted models for the counts and for the waiting times, tested whether neighbouring packets are independent, and estimated the loss rates with a Bayesian Beta-Binomial model. Independence did not hold on any of the three networks. The variance of the per-second loss count was 1.59, 5.31, 10.17 times the mean, where a Poisson model gives 1, and after a single loss the next packet was 31 to 43 times more likely to be lost. This shows up directly in the error bars. Over 2,000 simulated captures, the standard 95% interval for the loss rate contained the true value in only 40.3% to 85.7% of cases. Reducing the sample size by a design effect raised coverage to between 93.3% and 94.0%. A power study suggests recording at least ten minutes on each network once we move on to real measurements.</w:t>
       </w:r>
     </w:p>
     <w:bookmarkStart w:id="20" w:name="keywords"/>
@@ -84,7 +84,7 @@
           <w:color w:val="000000"/>
           <w:sz w:val="18"/>
         </w:rPr>
-        <w:t>Index Terms—</w:t>
+        <w:t xml:space="preserve">Index Terms: </w:t>
       </w:r>
       <w:r>
         <w:rPr>
@@ -126,7 +126,7 @@
           <w:color w:val="000000"/>
           <w:sz w:val="20"/>
         </w:rPr>
-        <w:t xml:space="preserve">Most of us have run into packet loss without giving it a name. A video call on bad Wi-Fi stalls for a second, a word goes missing from the audio, and then things pick up again. What is happening underneath is simple enough. The app sends small packets at a steady rate and a few of them never make it. The fraction that goes missing is the loss rate. It shows up in service agreements, and it is what protocol designers look at when they tune retransmission timers or pick how much error correction to add.</w:t>
+        <w:t xml:space="preserve">Most people have run into packet loss without calling it that. A video call on poor Wi-Fi freezes for a second, or a word drops out of the audio, and then the call picks up again. Underneath, the application is sending small packets at a fixed rate, and a few of them never reach the other end. The fraction that goes missing is called the loss rate. It is the figure written into service agreements, and protocol designers rely on it when they choose retransmission timers or decide how much error correction a stream should carry.</w:t>
       </w:r>
     </w:p>
     <w:p>
@@ -142,7 +142,7 @@
           <w:color w:val="000000"/>
           <w:sz w:val="20"/>
         </w:rPr>
-        <w:t xml:space="preserve">The catch is that a loss rate says how many packets were lost but not when. Lose ten packets scattered across a minute and the decoder quietly fills each hole; nobody notices. Lose ten in a row and the picture freezes. The standard textbook move is to assume that every packet is lost on its own, with the same small probability</w:t>
+        <w:t xml:space="preserve">What the loss rate does not show is how the losses are spread out in time. If ten packets are lost at scattered points over a minute, the decoder can hide each gap and the user hardly notices. Ten losses in a row produce an obvious freeze. Textbook models usually sidestep this by assuming that every packet is lost independently with the same small probability</w:t>
       </w:r>
       <w:r>
         <w:rPr>
@@ -163,7 +163,7 @@
           <w:color w:val="000000"/>
           <w:sz w:val="20"/>
         </w:rPr>
-        <w:t xml:space="preserve">. It is a convenient assumption because it hands you two clean results: the number of losses in a short window is Binomial (so close to Poisson), and the time between losses is exponential. If losses cluster, neither result holds, and any error bars built on top of them are off as well.</w:t>
+        <w:t xml:space="preserve">. The assumption is convenient: it makes the number of losses in a short window Binomial, and so close to Poisson, and the time between losses exponential. Once losses start to cluster, neither result is correct, and the error bars worked out from them are wrong too.</w:t>
       </w:r>
     </w:p>
     <w:p>
@@ -179,7 +179,7 @@
           <w:color w:val="000000"/>
           <w:sz w:val="20"/>
         </w:rPr>
-        <w:t xml:space="preserve">So we asked three things. How far does independence actually break? Which of the usual tests notice? And what happens to the interval people quote for the loss rate? The work is planned in two phases, and this report is about the first one, a simulation study. Since we picked every network’s true parameters ourselves, we always know the right answer, which lets us check each estimate and each test before we point the same code at real data in Phase 2.</w:t>
+        <w:t xml:space="preserve">Our aim was to find out how badly independence fails, which standard tests pick up the failure, and what it does to the interval estimates usually reported for the loss rate. The work is split into two phases, and this report covers Phase 1, a simulation study. Because we set the true parameters of each network ourselves, we can compare every estimate and test with the correct answer before the same code is used on real data. Phase 2 will apply that code to real captures.</w:t>
       </w:r>
     </w:p>
     <w:p>
@@ -195,7 +195,7 @@
           <w:color w:val="000000"/>
           <w:sz w:val="20"/>
         </w:rPr>
-        <w:t xml:space="preserve">Section II gives some background. Section III describes the loss model and how we generated the data, Section IV goes through the statistical methods, and Section V has the results. We discuss what they mean, and where the study falls short, in Section VI, and wrap up in Section VII.</w:t>
+        <w:t xml:space="preserve">The report is organised as follows. Section II gives some background, Section III sets out the loss model and how the data were generated, Section IV describes the statistical methods and Section V reports the results. Section VI discusses what the results mean and where the study is limited, and Section VII concludes.</w:t>
       </w:r>
     </w:p>
     <w:bookmarkEnd w:id="21"/>
@@ -228,7 +228,7 @@
           <w:color w:val="000000"/>
           <w:sz w:val="20"/>
         </w:rPr>
-        <w:t xml:space="preserve">Using a hidden two-state chain for bursty errors is an old idea. E. N. Gilbert proposed it in 1960 for errors on telephone lines, and E. O. Elliott generalised it in 1963 so that either state could produce errors. More than sixty years later, the Gilbert-Elliott model is still where most people start when they want to describe bursty loss.</w:t>
+        <w:t xml:space="preserve">Modelling bursty errors with a hidden two-state chain goes back to E. N. Gilbert, who used it for errors on telephone lines in 1960. In 1963 E. O. Elliott extended the model so that errors could occur in either state. The Gilbert-Elliott model that came out of this is still the usual starting point for bursty loss.</w:t>
       </w:r>
     </w:p>
     <w:p>
@@ -244,7 +244,7 @@
           <w:color w:val="000000"/>
           <w:sz w:val="20"/>
         </w:rPr>
-        <w:t xml:space="preserve">Nor is it news that Internet losses are not independent. Measurement work in the 1990s found that probe packets sent close together were often lost together, that TCP transfers lost packets in correlated episodes, and that Markov chains did a decent job of describing loss timing in multicast traces. Later studies fitted Gilbert models to voice traffic and tied burst length to how bad a call sounds.</w:t>
+        <w:t xml:space="preserve">It has also been known for many years that Internet losses are not independent. Measurement studies in the 1990s showed that probe packets sent close together were often lost together, and that losses in TCP transfers came in correlated episodes. The timing of loss in multicast traces could be described reasonably well with Markov chains. Later studies fitted Gilbert models to voice traffic and related the length of a loss burst to how poor a call sounds.</w:t>
       </w:r>
     </w:p>
     <w:p>
@@ -260,7 +260,7 @@
           <w:color w:val="000000"/>
           <w:sz w:val="20"/>
         </w:rPr>
-        <w:t xml:space="preserve">That earlier work mostly set out to describe the loss process. We come at it from the statistics side instead. Which standard tests pick up the dependence, how much data do they need, and how far off are the usual intervals if you ignore it? For that last question we borrowed the design effect from survey sampling. There it is used when people are sampled in clusters, say whole households, rather than one by one, which turns out to be a close match for packets lost in bursts.</w:t>
+        <w:t xml:space="preserve">Most of this earlier work sets out to describe the loss process. Our interest is more statistical. We want to know which standard tests detect the dependence, how much data they need before they do, and how far ordinary interval estimates drift from the truth when the dependence is ignored. For the last of these we use the design effect from survey sampling, where it corrects for people being sampled in clusters instead of one at a time.</w:t>
       </w:r>
     </w:p>
     <w:bookmarkEnd w:id="22"/>
@@ -309,7 +309,7 @@
           <w:color w:val="000000"/>
           <w:sz w:val="20"/>
         </w:rPr>
-        <w:t xml:space="preserve">It helps to think of the network as having two moods, Good (G) and Bad (B). We never see the mood itself, only what it does to the packets. Before each packet the channel can switch: Good to Bad with probability</w:t>
+        <w:t xml:space="preserve">We treat the network as being in one of two hidden states, Good (G) or Bad (B). We cannot observe the state itself, only what it does to the packets. Before each packet, the channel switches from Good to Bad with probability</w:t>
       </w:r>
       <w:r>
         <w:rPr>
@@ -330,16 +330,24 @@
           <w:color w:val="000000"/>
           <w:sz w:val="20"/>
         </w:rPr>
-        <w:t xml:space="preserve">, Bad to Good with probability</w:t>
-      </w:r>
-      <w:r>
-        <w:rPr>
-          <w:rFonts w:ascii="Times New Roman" w:hAnsi="Times New Roman" w:cs="Times New Roman" w:eastAsia="Times New Roman"/>
-          <w:color w:val="000000"/>
-          <w:sz w:val="20"/>
-        </w:rPr>
         <w:t xml:space="preserve"> </w:t>
       </w:r>
+      <w:r>
+        <w:rPr>
+          <w:rFonts w:ascii="Times New Roman" w:hAnsi="Times New Roman" w:cs="Times New Roman" w:eastAsia="Times New Roman"/>
+          <w:color w:val="000000"/>
+          <w:sz w:val="20"/>
+        </w:rPr>
+        <w:t xml:space="preserve">and from Bad back to Good with probability</w:t>
+      </w:r>
+      <w:r>
+        <w:rPr>
+          <w:rFonts w:ascii="Times New Roman" w:hAnsi="Times New Roman" w:cs="Times New Roman" w:eastAsia="Times New Roman"/>
+          <w:color w:val="000000"/>
+          <w:sz w:val="20"/>
+        </w:rPr>
+        <w:t xml:space="preserve"> </w:t>
+      </w:r>
       <m:oMath>
         <m:r>
           <m:t>r</m:t>
@@ -351,7 +359,7 @@
           <w:color w:val="000000"/>
           <w:sz w:val="20"/>
         </w:rPr>
-        <w:t xml:space="preserve">. In Good, a packet is lost with a small probability</w:t>
+        <w:t xml:space="preserve">. In the Good state a packet is lost with a small probability</w:t>
       </w:r>
       <w:r>
         <w:rPr>
@@ -381,7 +389,7 @@
           <w:color w:val="000000"/>
           <w:sz w:val="20"/>
         </w:rPr>
-        <w:t xml:space="preserve">. In Bad, the loss probability</w:t>
+        <w:t xml:space="preserve">; in the Bad state the probability</w:t>
       </w:r>
       <w:r>
         <w:rPr>
@@ -419,7 +427,7 @@
           <w:color w:val="000000"/>
           <w:sz w:val="20"/>
         </w:rPr>
-        <w:t xml:space="preserve">is much higher. Over a long run, the channel has to enter Bad as often as it leaves, and that balance gives the share of time spent in Bad and, from it, the overall loss rate:</w:t>
+        <w:t xml:space="preserve">is much larger. Over a long run, the flow into the Bad state has to equal the flow out of it. This gives the share of time spent in Bad, and from it the overall loss rate:</w:t>
       </w:r>
     </w:p>
     <w:p>
@@ -621,7 +629,7 @@
           <w:color w:val="000000"/>
           <w:sz w:val="20"/>
         </w:rPr>
-        <w:t xml:space="preserve">How long the channel stays in a state is geometric, with an average of</w:t>
+        <w:t xml:space="preserve">The number of packets spent in a state before leaving it is geometric, with a mean of</w:t>
       </w:r>
       <w:r>
         <w:rPr>
@@ -659,7 +667,7 @@
           <w:color w:val="000000"/>
           <w:sz w:val="20"/>
         </w:rPr>
-        <w:t xml:space="preserve">packets in Good and</w:t>
+        <w:t xml:space="preserve">packets for Good and</w:t>
       </w:r>
       <w:r>
         <w:rPr>
@@ -697,7 +705,7 @@
           <w:color w:val="000000"/>
           <w:sz w:val="20"/>
         </w:rPr>
-        <w:t xml:space="preserve">in Bad. A burst is just what happens when the channel drops into Bad for a handful of packets.</w:t>
+        <w:t xml:space="preserve">for Bad. A burst of losses happens whenever the channel drops into the Bad state for a few packets.</w:t>
       </w:r>
     </w:p>
     <w:bookmarkEnd w:id="23"/>
@@ -730,7 +738,7 @@
           <w:color w:val="000000"/>
           <w:sz w:val="20"/>
         </w:rPr>
-        <w:t xml:space="preserve">Table I gives the parameters of our three networks. We chose them to cover a low, a middle and a high loss rate, and we let the Bad spells get longer as the network gets worse, since that is roughly what you would expect on a real link. Every network sends 50 packets a second, one every 20 ms, which is about what a voice call does, and we run each for 3</w:t>
+        <w:t xml:space="preserve">Table I lists the parameters for the three networks. We chose them to give a low, a medium and a high loss rate, with longer Bad spells on the worse networks. Every network sends a constant 50 packets per second, one every 20 ms, which is close to the rate of a voice call. Each run lasts 3</w:t>
       </w:r>
       <w:r>
         <w:rPr>
@@ -746,7 +754,7 @@
           <w:color w:val="000000"/>
           <w:sz w:val="20"/>
         </w:rPr>
-        <w:t xml:space="preserve">600 s. That works out to 180</w:t>
+        <w:t xml:space="preserve">600 s, so there are 180</w:t>
       </w:r>
       <w:r>
         <w:rPr>
@@ -778,7 +786,7 @@
           <w:color w:val="000000"/>
           <w:sz w:val="20"/>
         </w:rPr>
-        <w:t xml:space="preserve">000 overall. All the randomness comes from one seed, 2026, so rerunning the code gives back exactly the numbers in this report.</w:t>
+        <w:t xml:space="preserve">000 overall. All random numbers come from the seed 2026, so anyone rerunning the code gets exactly the numbers in this report.</w:t>
       </w:r>
     </w:p>
     <w:p>
@@ -1769,7 +1777,7 @@
           <w:color w:val="000000"/>
           <w:sz w:val="20"/>
         </w:rPr>
-        <w:t xml:space="preserve">The obvious way to simulate the chain is to step it forward one packet at a time. That works, but it is slow. What we do instead is draw the length of each Good or Bad stay straight from the geometric distribution, place the stays one after another, and only then go through the packets and decide which were lost, using the loss probability of whichever state each packet landed in. The process is exactly the same; it just runs much faster. From every trace we take out four things: the loss count in each 1-s window (3</w:t>
+        <w:t xml:space="preserve">The chain could be simulated by stepping forward one packet at a time, but that is slow. Instead, we draw the length of each stay in Good or Bad directly from the geometric distribution and place the stays one after another. Then, for every packet, we decide whether it is lost using the loss probability of the state it falls in. The process is the same, just far quicker to generate. We take four things from each trace: the number of losses in each 1-s window (3</w:t>
       </w:r>
       <w:r>
         <w:rPr>
@@ -1785,7 +1793,7 @@
           <w:color w:val="000000"/>
           <w:sz w:val="20"/>
         </w:rPr>
-        <w:t xml:space="preserve">600 per network), the gaps between losses, the burst lengths (runs of back-to-back losses), and how often a delivered (N) or a lost (L) packet is followed by each kind. Fig. 1 plots the first few minutes. You do not need any statistics to see that Wi-Fi and mobile losses come in clumps.</w:t>
+        <w:t xml:space="preserve">600 counts per network), the gaps between successive losses, the lengths of bursts (runs of consecutive losses), and how often a delivered (N) or lost (L) packet is followed by each type of packet. Fig. 1 plots the first few minutes of each trace. On Wi-Fi and the mobile hotspot the clumping can already be seen by eye.</w:t>
       </w:r>
     </w:p>
     <w:p>
@@ -1855,7 +1863,7 @@
           <w:color w:val="000000"/>
           <w:sz w:val="16"/>
         </w:rPr>
-        <w:t xml:space="preserve">Losses per second over the first five minutes of each simulated trace. On Wi-Fi and the mobile hotspot, losses arrive in clusters rather than one at a time.</w:t>
+        <w:t xml:space="preserve">Losses per second during the first five minutes of each simulated trace. On Wi-Fi and the mobile hotspot the losses come in clusters instead of one at a time.</w:t>
       </w:r>
     </w:p>
     <w:bookmarkEnd w:id="28"/>
@@ -1965,7 +1973,7 @@
           <w:color w:val="000000"/>
           <w:sz w:val="20"/>
         </w:rPr>
-        <w:t xml:space="preserve">, the natural first model is a Poisson, and its maximum-likelihood estimate is just the average count,</w:t>
+        <w:t xml:space="preserve">, the first model we fit is the Poisson distribution, whose maximum-likelihood estimate is simply the mean count,</w:t>
       </w:r>
       <w:r>
         <w:rPr>
@@ -2009,7 +2017,7 @@
           <w:color w:val="000000"/>
           <w:sz w:val="20"/>
         </w:rPr>
-        <w:t xml:space="preserve">. The natural second model is the Negative Binomial:</w:t>
+        <w:t xml:space="preserve">. The natural alternative is the Negative Binomial:</w:t>
       </w:r>
     </w:p>
     <w:p>
@@ -2302,7 +2310,7 @@
           <w:color w:val="000000"/>
           <w:sz w:val="20"/>
         </w:rPr>
-        <w:t xml:space="preserve">A handy way to think of the Negative Binomial is as a Poisson whose rate does not sit still, which is what you get when a network keeps switching between good and bad stretches. The</w:t>
+        <w:t xml:space="preserve">The Negative Binomial can be thought of as a Poisson whose rate changes over time, which is what a network moving between good and bad periods produces. The extra term</w:t>
       </w:r>
       <w:r>
         <w:rPr>
@@ -2364,7 +2372,7 @@
           <w:color w:val="000000"/>
           <w:sz w:val="20"/>
         </w:rPr>
-        <w:t xml:space="preserve">term is what lets the variance climb above the mean, something a Poisson simply cannot do. We fit it by fixing the mean at</w:t>
+        <w:t xml:space="preserve">lets the variance exceed the mean, something the Poisson cannot do. We fit it by fixing the mean at</w:t>
       </w:r>
       <w:r>
         <w:rPr>
@@ -2400,7 +2408,7 @@
           <w:color w:val="000000"/>
           <w:sz w:val="20"/>
         </w:rPr>
-        <w:t xml:space="preserve">and searching over</w:t>
+        <w:t xml:space="preserve">and searching for the</w:t>
       </w:r>
       <w:r>
         <w:rPr>
@@ -2444,7 +2452,7 @@
           <w:color w:val="000000"/>
           <w:sz w:val="20"/>
         </w:rPr>
-        <w:t xml:space="preserve">for the highest likelihood.</w:t>
+        <w:t xml:space="preserve">that maximises the likelihood.</w:t>
       </w:r>
     </w:p>
     <w:p>
@@ -2460,7 +2468,7 @@
           <w:color w:val="000000"/>
           <w:sz w:val="20"/>
         </w:rPr>
-        <w:t xml:space="preserve">For the gaps between losses, the exponential is the natural first model, with</w:t>
+        <w:t xml:space="preserve">For the gaps between losses we begin with the exponential distribution, with</w:t>
       </w:r>
       <w:r>
         <w:rPr>
@@ -2513,7 +2521,7 @@
           <w:color w:val="000000"/>
           <w:sz w:val="20"/>
         </w:rPr>
-        <w:t xml:space="preserve">. Our alternative mixes two exponentials together, which is known as a two-phase hyperexponential:</w:t>
+        <w:t xml:space="preserve">, and compare it with a mixture of two exponentials known as the two-phase hyperexponential:</w:t>
       </w:r>
     </w:p>
     <w:p>
@@ -2696,7 +2704,7 @@
           <w:color w:val="000000"/>
           <w:sz w:val="20"/>
         </w:rPr>
-        <w:t xml:space="preserve">The thinking behind it is that gaps come in two kinds. Short gaps, with the fast rate</w:t>
+        <w:t xml:space="preserve">The idea behind the mixture is that gaps come in two types. Short gaps, with the fast rate</w:t>
       </w:r>
       <w:r>
         <w:rPr>
@@ -2726,7 +2734,7 @@
           <w:color w:val="000000"/>
           <w:sz w:val="20"/>
         </w:rPr>
-        <w:t xml:space="preserve">, fall inside a burst. Long gaps, with the slow rate</w:t>
+        <w:t xml:space="preserve">, occur within a burst. Long gaps, with the slow rate</w:t>
       </w:r>
       <w:r>
         <w:rPr>
@@ -2756,7 +2764,7 @@
           <w:color w:val="000000"/>
           <w:sz w:val="20"/>
         </w:rPr>
-        <w:t xml:space="preserve">, are the quiet stretches between bursts. The problem is that no gap comes labelled, so we fit the mixture with the Expectation-Maximisation (EM) algorithm. Each round has two steps: first estimate, for every gap, how likely it is to be a short one; then refit</w:t>
+        <w:t xml:space="preserve">, occur between bursts. We never know which type a particular gap is, so we fit the mixture with the Expectation-Maximisation (EM) algorithm. In each iteration the E-step works out the probability that each gap is a short one, and the M-step updates</w:t>
       </w:r>
       <w:r>
         <w:rPr>
@@ -2853,7 +2861,7 @@
           <w:color w:val="000000"/>
           <w:sz w:val="20"/>
         </w:rPr>
-        <w:t xml:space="preserve">with those likelihoods as weights. We keep going until the fit stops getting better. Models are compared using the Akaike Information Criterion,</w:t>
+        <w:t xml:space="preserve">with these probabilities as weights. We stop once the fit no longer improves. Models are compared with the Akaike Information Criterion,</w:t>
       </w:r>
       <w:r>
         <w:rPr>
@@ -2908,7 +2916,7 @@
           <w:color w:val="000000"/>
           <w:sz w:val="20"/>
         </w:rPr>
-        <w:t xml:space="preserve">. It rewards a good fit but charges a penalty for each extra parameter, and the lower score wins.</w:t>
+        <w:t xml:space="preserve">. It rewards a good fit but adds a penalty for each extra parameter, so a lower value means a better model.</w:t>
       </w:r>
     </w:p>
     <w:bookmarkEnd w:id="30"/>
@@ -2941,7 +2949,7 @@
           <w:color w:val="000000"/>
           <w:sz w:val="20"/>
         </w:rPr>
-        <w:t xml:space="preserve">For the count models, we line up how many windows actually had each count against how many the model predicts and use the Pearson statistic</w:t>
+        <w:t xml:space="preserve">We check the count models by comparing the observed number of windows with each count against the number the model expects, using the Pearson statistic</w:t>
       </w:r>
       <w:r>
         <w:rPr>
@@ -3064,7 +3072,7 @@
           <w:color w:val="000000"/>
           <w:sz w:val="20"/>
         </w:rPr>
-        <w:t xml:space="preserve">. The test gets shaky when expected counts are tiny, which happens in the tail, so we merge tail bins until every expected count is at least 5. Degrees of freedom are the number of bins, less one, less the number of fitted parameters. We also run the index-of-dispersion test. For Poisson counts,</w:t>
+        <w:t xml:space="preserve">. The test is unreliable when expected counts in the tail are small, so tail bins are merged until every expected count is at least 5. The degrees of freedom are the number of bins, minus one, minus the number of fitted parameters. We also apply the index-of-dispersion test. If the counts are Poisson,</w:t>
       </w:r>
       <w:r>
         <w:rPr>
@@ -3140,7 +3148,7 @@
           <w:color w:val="000000"/>
           <w:sz w:val="20"/>
         </w:rPr>
-        <w:t xml:space="preserve">follows</w:t>
+        <w:t xml:space="preserve">follows a</w:t>
       </w:r>
       <w:r>
         <w:rPr>
@@ -3184,7 +3192,15 @@
           <w:color w:val="000000"/>
           <w:sz w:val="20"/>
         </w:rPr>
-        <w:t xml:space="preserve">, so a variance well above the mean shows up as a huge statistic.</w:t>
+        <w:t xml:space="preserve"> </w:t>
+      </w:r>
+      <w:r>
+        <w:rPr>
+          <w:rFonts w:ascii="Times New Roman" w:hAnsi="Times New Roman" w:cs="Times New Roman" w:eastAsia="Times New Roman"/>
+          <w:color w:val="000000"/>
+          <w:sz w:val="20"/>
+        </w:rPr>
+        <w:t xml:space="preserve">distribution, so a variance well above the mean gives a very large value of the statistic.</w:t>
       </w:r>
     </w:p>
     <w:p>
@@ -3300,7 +3316,7 @@
           <w:color w:val="000000"/>
           <w:sz w:val="20"/>
         </w:rPr>
-        <w:t xml:space="preserve">, the biggest vertical gap between the data’s cumulative curve and the model’s. There is a trap here that is easy to miss. The usual KS tables assume the model was fixed before you looked at the data. We estimate the rate from the very data we are testing, which makes the fit look better than it is and the p-value too large. Our fix is a parametric bootstrap: simulate a fake data set from the fitted model, refit it, note its</w:t>
+        <w:t xml:space="preserve">, the largest vertical distance between the cumulative curve of the data and that of the model. One complication is that the standard KS tables assume the model was fixed before the data were seen. Here the rate is estimated from the same data, which makes the fit look better than it is and leaves the textbook p-value too large. We get the p-value from a parametric bootstrap instead. A synthetic data set is simulated from the fitted model, the model is refitted, and the new</w:t>
       </w:r>
       <w:r>
         <w:rPr>
@@ -3321,7 +3337,15 @@
           <w:color w:val="000000"/>
           <w:sz w:val="20"/>
         </w:rPr>
-        <w:t xml:space="preserve">, and repeat, 2</w:t>
+        <w:t xml:space="preserve"> </w:t>
+      </w:r>
+      <w:r>
+        <w:rPr>
+          <w:rFonts w:ascii="Times New Roman" w:hAnsi="Times New Roman" w:cs="Times New Roman" w:eastAsia="Times New Roman"/>
+          <w:color w:val="000000"/>
+          <w:sz w:val="20"/>
+        </w:rPr>
+        <w:t xml:space="preserve">is recorded. Doing this 2</w:t>
       </w:r>
       <w:r>
         <w:rPr>
@@ -3337,7 +3361,7 @@
           <w:color w:val="000000"/>
           <w:sz w:val="20"/>
         </w:rPr>
-        <w:t xml:space="preserve">000 times for the exponential and 500 for the mixture. That shows how big</w:t>
+        <w:t xml:space="preserve">000 times for the exponential and 500 times for the mixture shows the range of</w:t>
       </w:r>
       <w:r>
         <w:rPr>
@@ -3366,7 +3390,7 @@
           <w:color w:val="000000"/>
           <w:sz w:val="20"/>
         </w:rPr>
-        <w:t xml:space="preserve">normally gets when the model really is right.</w:t>
+        <w:t xml:space="preserve">to expect if the model were in fact correct.</w:t>
       </w:r>
     </w:p>
     <w:bookmarkEnd w:id="31"/>
@@ -3399,7 +3423,7 @@
           <w:color w:val="000000"/>
           <w:sz w:val="20"/>
         </w:rPr>
-        <w:t xml:space="preserve">The Wald-Wolfowitz runs test treats the trace as a string of 0s and 1s (delivered or lost) and counts the runs</w:t>
+        <w:t xml:space="preserve">The Wald-Wolfowitz runs test works on the 0/1 sequence of delivered and lost packets and counts the number of runs</w:t>
       </w:r>
       <w:r>
         <w:rPr>
@@ -3420,7 +3444,7 @@
           <w:color w:val="000000"/>
           <w:sz w:val="20"/>
         </w:rPr>
-        <w:t xml:space="preserve">, the unbroken stretches of the same outcome. With</w:t>
+        <w:t xml:space="preserve">, a run being a stretch of identical outcomes. With</w:t>
       </w:r>
       <w:r>
         <w:rPr>
@@ -3496,7 +3520,7 @@
           <w:color w:val="000000"/>
           <w:sz w:val="20"/>
         </w:rPr>
-        <w:t xml:space="preserve">deliveries, independence predicts</w:t>
+        <w:t xml:space="preserve">deliveries, independence gives</w:t>
       </w:r>
     </w:p>
     <w:p>
@@ -3762,7 +3786,7 @@
           <w:color w:val="000000"/>
           <w:sz w:val="20"/>
         </w:rPr>
-        <w:t xml:space="preserve">When losses stick together, the string flips between lost and delivered less often than chance would, so</w:t>
+        <w:t xml:space="preserve">When losses tend to occur together, the sequence switches between lost and delivered less often than it would by chance, and</w:t>
       </w:r>
       <w:r>
         <w:rPr>
@@ -3791,7 +3815,7 @@
           <w:color w:val="000000"/>
           <w:sz w:val="20"/>
         </w:rPr>
-        <w:t xml:space="preserve">comes out low.</w:t>
+        <w:t xml:space="preserve">ends up smaller than expected.</w:t>
       </w:r>
     </w:p>
     <w:p>
@@ -3807,7 +3831,7 @@
           <w:color w:val="000000"/>
           <w:sz w:val="20"/>
         </w:rPr>
-        <w:t xml:space="preserve">The Markov-chain test gets at the question more directly. Does what happened to one packet change the odds for the next? Under</w:t>
+        <w:t xml:space="preserve">The Markov-chain test asks the question more directly: does the outcome for one packet depend on the packet before it? Under</w:t>
       </w:r>
       <w:r>
         <w:rPr>
@@ -3837,7 +3861,15 @@
           <w:color w:val="000000"/>
           <w:sz w:val="20"/>
         </w:rPr>
-        <w:t xml:space="preserve">, no: every packet has the same loss probability. Under</w:t>
+        <w:t xml:space="preserve"> </w:t>
+      </w:r>
+      <w:r>
+        <w:rPr>
+          <w:rFonts w:ascii="Times New Roman" w:hAnsi="Times New Roman" w:cs="Times New Roman" w:eastAsia="Times New Roman"/>
+          <w:color w:val="000000"/>
+          <w:sz w:val="20"/>
+        </w:rPr>
+        <w:t xml:space="preserve">all packets share a single loss probability. Under</w:t>
       </w:r>
       <w:r>
         <w:rPr>
@@ -3867,7 +3899,15 @@
           <w:color w:val="000000"/>
           <w:sz w:val="20"/>
         </w:rPr>
-        <w:t xml:space="preserve">, yes: there is one probability after a delivered packet,</w:t>
+        <w:t xml:space="preserve"> </w:t>
+      </w:r>
+      <w:r>
+        <w:rPr>
+          <w:rFonts w:ascii="Times New Roman" w:hAnsi="Times New Roman" w:cs="Times New Roman" w:eastAsia="Times New Roman"/>
+          <w:color w:val="000000"/>
+          <w:sz w:val="20"/>
+        </w:rPr>
+        <w:t xml:space="preserve">there are two,</w:t>
       </w:r>
       <w:r>
         <w:rPr>
@@ -3919,7 +3959,15 @@
           <w:color w:val="000000"/>
           <w:sz w:val="20"/>
         </w:rPr>
-        <w:t xml:space="preserve">, and another after a lost one,</w:t>
+        <w:t xml:space="preserve"> </w:t>
+      </w:r>
+      <w:r>
+        <w:rPr>
+          <w:rFonts w:ascii="Times New Roman" w:hAnsi="Times New Roman" w:cs="Times New Roman" w:eastAsia="Times New Roman"/>
+          <w:color w:val="000000"/>
+          <w:sz w:val="20"/>
+        </w:rPr>
+        <w:t xml:space="preserve">after a delivered packet and</w:t>
       </w:r>
       <w:r>
         <w:rPr>
@@ -3971,7 +4019,15 @@
           <w:color w:val="000000"/>
           <w:sz w:val="20"/>
         </w:rPr>
-        <w:t xml:space="preserve">. Writing</w:t>
+        <w:t xml:space="preserve"> </w:t>
+      </w:r>
+      <w:r>
+        <w:rPr>
+          <w:rFonts w:ascii="Times New Roman" w:hAnsi="Times New Roman" w:cs="Times New Roman" w:eastAsia="Times New Roman"/>
+          <w:color w:val="000000"/>
+          <w:sz w:val="20"/>
+        </w:rPr>
+        <w:t xml:space="preserve">after a lost one. Writing</w:t>
       </w:r>
       <w:r>
         <w:rPr>
@@ -4440,7 +4496,7 @@
           <w:color w:val="000000"/>
           <w:sz w:val="20"/>
         </w:rPr>
-        <w:t xml:space="preserve">, Wilks’ theorem tells us</w:t>
+        <w:t xml:space="preserve">, Wilks’ theorem says that</w:t>
       </w:r>
       <w:r>
         <w:rPr>
@@ -4478,7 +4534,7 @@
           <w:color w:val="000000"/>
           <w:sz w:val="20"/>
         </w:rPr>
-        <w:t xml:space="preserve">is roughly</w:t>
+        <w:t xml:space="preserve">is approximately</w:t>
       </w:r>
       <w:r>
         <w:rPr>
@@ -4559,7 +4615,7 @@
           <w:color w:val="000000"/>
           <w:sz w:val="20"/>
         </w:rPr>
-        <w:t xml:space="preserve">holds. The two estimates are worth keeping for their own sake, too. The ratio</w:t>
+        <w:t xml:space="preserve">holds. The two estimates are useful on their own as well. The ratio</w:t>
       </w:r>
       <w:r>
         <w:rPr>
@@ -4597,7 +4653,7 @@
           <w:color w:val="000000"/>
           <w:sz w:val="20"/>
         </w:rPr>
-        <w:t xml:space="preserve">says how much a loss raises the odds of another, and</w:t>
+        <w:t xml:space="preserve">measures how much a loss raises the chance of the next loss, and</w:t>
       </w:r>
       <w:r>
         <w:rPr>
@@ -4654,7 +4710,7 @@
           <w:color w:val="000000"/>
           <w:sz w:val="20"/>
         </w:rPr>
-        <w:t xml:space="preserve">is the average burst length.</w:t>
+        <w:t xml:space="preserve">gives the mean burst length.</w:t>
       </w:r>
     </w:p>
     <w:p>
@@ -4670,7 +4726,7 @@
           <w:color w:val="000000"/>
           <w:sz w:val="20"/>
         </w:rPr>
-        <w:t xml:space="preserve">To compare the three networks we stuck to rank-based tests. The counts are mostly zeros and heavily skewed, so anything that assumes normality would be on thin ice. Kruskal-Wallis compares all three together; pairwise Mann-Whitney tests compare them two at a time, with a Bonferroni correction so that running three tests does not quietly push up the false-alarm rate. A</w:t>
+        <w:t xml:space="preserve">The three networks are compared with rank-based tests, since the counts are mostly zero, strongly skewed and far from normal. The Kruskal-Wallis test compares all three networks together. Pairwise Mann-Whitney tests compare them two at a time, with a Bonferroni correction so that running three tests does not push up the false-alarm rate. A</w:t>
       </w:r>
       <w:r>
         <w:rPr>
@@ -4708,7 +4764,7 @@
           <w:color w:val="000000"/>
           <w:sz w:val="20"/>
         </w:rPr>
-        <w:t xml:space="preserve">test of homogeneity on the lost and delivered totals checks whether the loss proportion is the same on every network. All tests use</w:t>
+        <w:t xml:space="preserve">test of homogeneity on the totals of lost and delivered packets checks whether the loss proportion is the same on every network. All tests use</w:t>
       </w:r>
       <w:r>
         <w:rPr>
@@ -4771,7 +4827,7 @@
           <w:color w:val="000000"/>
           <w:sz w:val="20"/>
         </w:rPr>
-        <w:t xml:space="preserve">For the loss rate itself we went Bayesian. We start from a flat</w:t>
+        <w:t xml:space="preserve">We estimate the loss rate itself the Bayesian way. The prior is a flat</w:t>
       </w:r>
       <w:r>
         <w:rPr>
@@ -4818,16 +4874,21 @@
           <w:color w:val="000000"/>
           <w:sz w:val="20"/>
         </w:rPr>
+        <w:t xml:space="preserve">, which treats every loss rate between 0 and 1 as equally likely before any data are seen. After</w:t>
+      </w:r>
+      <w:r>
+        <w:rPr>
+          <w:rFonts w:ascii="Times New Roman" w:hAnsi="Times New Roman" w:cs="Times New Roman" w:eastAsia="Times New Roman"/>
+          <w:color w:val="000000"/>
+          <w:sz w:val="20"/>
+        </w:rPr>
         <w:t xml:space="preserve"> </w:t>
       </w:r>
-      <w:r>
-        <w:rPr>
-          <w:rFonts w:ascii="Times New Roman" w:hAnsi="Times New Roman" w:cs="Times New Roman" w:eastAsia="Times New Roman"/>
-          <w:color w:val="000000"/>
-          <w:sz w:val="20"/>
-        </w:rPr>
-        <w:t xml:space="preserve">prior, meaning that before seeing any data we treat every loss rate between 0 and 1 as equally likely. After</w:t>
-      </w:r>
+      <m:oMath>
+        <m:r>
+          <m:t>k</m:t>
+        </m:r>
+      </m:oMath>
       <w:r>
         <w:rPr>
           <w:rFonts w:ascii="Times New Roman" w:hAnsi="Times New Roman" w:cs="Times New Roman" w:eastAsia="Times New Roman"/>
@@ -4836,9 +4897,25 @@
         </w:rPr>
         <w:t xml:space="preserve"> </w:t>
       </w:r>
+      <w:r>
+        <w:rPr>
+          <w:rFonts w:ascii="Times New Roman" w:hAnsi="Times New Roman" w:cs="Times New Roman" w:eastAsia="Times New Roman"/>
+          <w:color w:val="000000"/>
+          <w:sz w:val="20"/>
+        </w:rPr>
+        <w:t xml:space="preserve">losses in</w:t>
+      </w:r>
+      <w:r>
+        <w:rPr>
+          <w:rFonts w:ascii="Times New Roman" w:hAnsi="Times New Roman" w:cs="Times New Roman" w:eastAsia="Times New Roman"/>
+          <w:color w:val="000000"/>
+          <w:sz w:val="20"/>
+        </w:rPr>
+        <w:t xml:space="preserve"> </w:t>
+      </w:r>
       <m:oMath>
         <m:r>
-          <m:t>k</m:t>
+          <m:t>n</m:t>
         </m:r>
       </m:oMath>
       <w:r>
@@ -4855,36 +4932,7 @@
           <w:color w:val="000000"/>
           <w:sz w:val="20"/>
         </w:rPr>
-        <w:t xml:space="preserve">losses in</w:t>
-      </w:r>
-      <w:r>
-        <w:rPr>
-          <w:rFonts w:ascii="Times New Roman" w:hAnsi="Times New Roman" w:cs="Times New Roman" w:eastAsia="Times New Roman"/>
-          <w:color w:val="000000"/>
-          <w:sz w:val="20"/>
-        </w:rPr>
-        <w:t xml:space="preserve"> </w:t>
-      </w:r>
-      <m:oMath>
-        <m:r>
-          <m:t>n</m:t>
-        </m:r>
-      </m:oMath>
-      <w:r>
-        <w:rPr>
-          <w:rFonts w:ascii="Times New Roman" w:hAnsi="Times New Roman" w:cs="Times New Roman" w:eastAsia="Times New Roman"/>
-          <w:color w:val="000000"/>
-          <w:sz w:val="20"/>
-        </w:rPr>
-        <w:t xml:space="preserve"> </w:t>
-      </w:r>
-      <w:r>
-        <w:rPr>
-          <w:rFonts w:ascii="Times New Roman" w:hAnsi="Times New Roman" w:cs="Times New Roman" w:eastAsia="Times New Roman"/>
-          <w:color w:val="000000"/>
-          <w:sz w:val="20"/>
-        </w:rPr>
-        <w:t xml:space="preserve">packets the posterior is</w:t>
+        <w:t xml:space="preserve">packets the posterior becomes</w:t>
       </w:r>
       <w:r>
         <w:rPr>
@@ -4961,7 +5009,7 @@
           <w:color w:val="000000"/>
           <w:sz w:val="20"/>
         </w:rPr>
-        <w:t xml:space="preserve">, so in practice we just add the observed losses and deliveries to the prior. We report the posterior mean with a 95% credible interval, and for Campus Wi-Fi we also show how the posterior tightens as traffic comes in. To check that the networks really are ranked by loss rate, we draw 200</w:t>
+        <w:t xml:space="preserve">, so updating just means adding the observed losses and deliveries to the prior counts. We report the posterior mean with the 95% credible interval, and for Campus Wi-Fi we also show how the posterior narrows as more traffic is observed. To check whether the networks really are ordered by loss rate, we draw 200</w:t>
       </w:r>
       <w:r>
         <w:rPr>
@@ -4977,7 +5025,7 @@
           <w:color w:val="000000"/>
           <w:sz w:val="20"/>
         </w:rPr>
-        <w:t xml:space="preserve">000 values from each posterior and count how often Wired &lt; Wi-Fi &lt; Mobile comes out.</w:t>
+        <w:t xml:space="preserve">000 values from each posterior and count the share of draws in which Wired &lt; Wi-Fi &lt; Mobile.</w:t>
       </w:r>
     </w:p>
     <w:p>
@@ -4993,7 +5041,57 @@
           <w:color w:val="000000"/>
           <w:sz w:val="20"/>
         </w:rPr>
-        <w:t xml:space="preserve">The burst parameters get the same treatment. Each has its own posterior,</w:t>
+        <w:t xml:space="preserve">The burst parameters are handled the same way. We place separate posteriors on</w:t>
+      </w:r>
+      <w:r>
+        <w:rPr>
+          <w:rFonts w:ascii="Times New Roman" w:hAnsi="Times New Roman" w:cs="Times New Roman" w:eastAsia="Times New Roman"/>
+          <w:color w:val="000000"/>
+          <w:sz w:val="20"/>
+        </w:rPr>
+        <w:t xml:space="preserve"> </w:t>
+      </w:r>
+      <m:oMath>
+        <m:r>
+          <m:t>a</m:t>
+        </m:r>
+      </m:oMath>
+      <w:r>
+        <w:rPr>
+          <w:rFonts w:ascii="Times New Roman" w:hAnsi="Times New Roman" w:cs="Times New Roman" w:eastAsia="Times New Roman"/>
+          <w:color w:val="000000"/>
+          <w:sz w:val="20"/>
+        </w:rPr>
+        <w:t xml:space="preserve"> </w:t>
+      </w:r>
+      <w:r>
+        <w:rPr>
+          <w:rFonts w:ascii="Times New Roman" w:hAnsi="Times New Roman" w:cs="Times New Roman" w:eastAsia="Times New Roman"/>
+          <w:color w:val="000000"/>
+          <w:sz w:val="20"/>
+        </w:rPr>
+        <w:t xml:space="preserve">and</w:t>
+      </w:r>
+      <w:r>
+        <w:rPr>
+          <w:rFonts w:ascii="Times New Roman" w:hAnsi="Times New Roman" w:cs="Times New Roman" w:eastAsia="Times New Roman"/>
+          <w:color w:val="000000"/>
+          <w:sz w:val="20"/>
+        </w:rPr>
+        <w:t xml:space="preserve"> </w:t>
+      </w:r>
+      <m:oMath>
+        <m:r>
+          <m:t>b</m:t>
+        </m:r>
+      </m:oMath>
+      <w:r>
+        <w:rPr>
+          <w:rFonts w:ascii="Times New Roman" w:hAnsi="Times New Roman" w:cs="Times New Roman" w:eastAsia="Times New Roman"/>
+          <w:color w:val="000000"/>
+          <w:sz w:val="20"/>
+        </w:rPr>
+        <w:t xml:space="preserve">,</w:t>
       </w:r>
       <w:r>
         <w:rPr>
@@ -5197,7 +5295,7 @@
           <w:color w:val="000000"/>
           <w:sz w:val="20"/>
         </w:rPr>
-        <w:t xml:space="preserve">, and from these we get credible intervals for</w:t>
+        <w:t xml:space="preserve">, and these give credible intervals for</w:t>
       </w:r>
       <w:r>
         <w:rPr>
@@ -5235,7 +5333,7 @@
           <w:color w:val="000000"/>
           <w:sz w:val="20"/>
         </w:rPr>
-        <w:t xml:space="preserve">and for the burst length. As a sanity check on the independent model, we also ask it how often a window should hold at least 5 losses, and set that next to how often it really does.</w:t>
+        <w:t xml:space="preserve">and for the burst length. As a check on the independent model, we also use it to predict how often a window should contain at least 5 losses, and compare that with how often it actually happens.</w:t>
       </w:r>
     </w:p>
     <w:bookmarkEnd w:id="33"/>
@@ -5268,7 +5366,7 @@
           <w:color w:val="000000"/>
           <w:sz w:val="20"/>
         </w:rPr>
-        <w:t xml:space="preserve">Why bursts are bad news for interval estimates becomes clear from the variance of a sum:</w:t>
+        <w:t xml:space="preserve">The variance of a sum shows why bursts cause problems for interval estimates:</w:t>
       </w:r>
     </w:p>
     <w:p>
@@ -5500,7 +5598,7 @@
           <w:color w:val="000000"/>
           <w:sz w:val="20"/>
         </w:rPr>
-        <w:t xml:space="preserve">If the packets were independent, every covariance would be zero and the variance of the loss count would be</w:t>
+        <w:t xml:space="preserve">For independent packets every covariance term is zero, and the variance of the loss count is just</w:t>
       </w:r>
       <w:r>
         <w:rPr>
@@ -5546,7 +5644,7 @@
           <w:color w:val="000000"/>
           <w:sz w:val="20"/>
         </w:rPr>
-        <w:t xml:space="preserve">. Inside a burst, though, neighbouring packets tend to go the same way, so the covariances are positive and the true variance is bigger. The textbook interval leaves this out, so it is too narrow.</w:t>
+        <w:t xml:space="preserve">. Within a burst, though, neighbouring packets tend to have the same outcome. The covariances are positive and the true variance is larger. The standard interval ignores this and comes out too narrow.</w:t>
       </w:r>
     </w:p>
     <w:p>
@@ -5562,7 +5660,7 @@
           <w:color w:val="000000"/>
           <w:sz w:val="20"/>
         </w:rPr>
-        <w:t xml:space="preserve">To fix it, we cut each trace into blocks of</w:t>
+        <w:t xml:space="preserve">To correct for it, we divide each trace into blocks of</w:t>
       </w:r>
       <w:r>
         <w:rPr>
@@ -5600,7 +5698,7 @@
           <w:color w:val="000000"/>
           <w:sz w:val="20"/>
         </w:rPr>
-        <w:t xml:space="preserve">packets (10 s) and compare how much the block counts really vary with how much they would vary under independence:</w:t>
+        <w:t xml:space="preserve">packets (10 s) and compare the observed spread of the block counts with the spread independence would give:</w:t>
       </w:r>
     </w:p>
     <w:p>
@@ -5784,7 +5882,7 @@
           <w:color w:val="000000"/>
           <w:sz w:val="20"/>
         </w:rPr>
-        <w:t xml:space="preserve">(deff is never allowed below 1.) One way to read</w:t>
+        <w:t xml:space="preserve">where deff is not allowed to fall below 1. You can read</w:t>
       </w:r>
       <w:r>
         <w:rPr>
@@ -5826,7 +5924,7 @@
           <w:color w:val="000000"/>
           <w:sz w:val="20"/>
         </w:rPr>
-        <w:t xml:space="preserve">is as the number of independent packets that our correlated ones are worth. The adjusted posterior plugs in these effective counts,</w:t>
+        <w:t xml:space="preserve">as the number of independent packets that carry the same information as our correlated ones. The adjusted posterior uses these effective counts,</w:t>
       </w:r>
       <w:r>
         <w:rPr>
@@ -5939,7 +6037,7 @@
           <w:color w:val="000000"/>
           <w:sz w:val="20"/>
         </w:rPr>
-        <w:t xml:space="preserve">, and the interval comes out wider and more honest.</w:t>
+        <w:t xml:space="preserve">, and the interval it gives is wider and closer to the truth.</w:t>
       </w:r>
     </w:p>
     <w:bookmarkEnd w:id="34"/>
@@ -5972,7 +6070,7 @@
           <w:color w:val="000000"/>
           <w:sz w:val="20"/>
         </w:rPr>
-        <w:t xml:space="preserve">Some questions cannot be settled from one trace, so we repeat the whole experiment many times. The first is power, or how likely each test is to spot the bursts. For capture lengths from 15 s up to 600 s we simulate 2</w:t>
+        <w:t xml:space="preserve">Two of our questions cannot be answered from a single trace, so we answer them by repeating the experiment many times. The first is power, the probability that each test notices the bursts. For capture lengths between 15 s and 600 s, we simulate 2</w:t>
       </w:r>
       <w:r>
         <w:rPr>
@@ -5988,7 +6086,7 @@
           <w:color w:val="000000"/>
           <w:sz w:val="20"/>
         </w:rPr>
-        <w:t xml:space="preserve">000 captures per network and count how often each test rejects independence. The second is coverage, or how often a 95% interval actually contains the true loss rate. Here we simulate 2</w:t>
+        <w:t xml:space="preserve">000 captures per network and record how often each test rejects independence. The second is coverage: how often a 95% interval actually includes the true loss rate. For this we simulate 2</w:t>
       </w:r>
       <w:r>
         <w:rPr>
@@ -6004,7 +6102,7 @@
           <w:color w:val="000000"/>
           <w:sz w:val="20"/>
         </w:rPr>
-        <w:t xml:space="preserve">000 captures of 10 minutes per network, build both the naive and the adjusted interval for each one, and count the hits. With 2</w:t>
+        <w:t xml:space="preserve">000 captures of 10 minutes for each network, build the naive and the adjusted interval for every capture, and count how many contain the true value. With 2</w:t>
       </w:r>
       <w:r>
         <w:rPr>
@@ -6020,7 +6118,7 @@
           <w:color w:val="000000"/>
           <w:sz w:val="20"/>
         </w:rPr>
-        <w:t xml:space="preserve">000 repeats, each proportion is good to within about 0.011 (one standard error).</w:t>
+        <w:t xml:space="preserve">000 repetitions, each of these proportions has a standard error of about 0.011.</w:t>
       </w:r>
     </w:p>
     <w:bookmarkEnd w:id="35"/>
@@ -6049,7 +6147,7 @@
       <w:r>
         <w:drawing>
           <wp:inline>
-            <wp:extent cx="3200400" cy="968501"/>
+            <wp:extent cx="3200400" cy="968500"/>
             <wp:effectExtent b="0" l="0" r="0" t="0"/>
             <wp:docPr descr="" title="" id="38" name="Picture"/>
             <a:graphic>
@@ -6070,7 +6168,7 @@
                   <pic:spPr bwMode="auto">
                     <a:xfrm>
                       <a:off x="0" y="0"/>
-                      <a:ext cx="3200400" cy="968501"/>
+                      <a:ext cx="3200400" cy="968500"/>
                     </a:xfrm>
                     <a:prstGeom prst="rect">
                       <a:avLst/>
@@ -6137,7 +6235,7 @@
           <w:color w:val="000000"/>
           <w:sz w:val="16"/>
         </w:rPr>
-        <w:t xml:space="preserve">losses in one second, on a log scale. The Poisson fit (dashed) drops far below the real tail; the Negative Binomial (green) follows it.</w:t>
+        <w:t xml:space="preserve">losses in one second, on a log scale. The Poisson fit (dashed) falls well below the observed tail, while the Negative Binomial (green) stays close to it.</w:t>
       </w:r>
     </w:p>
     <w:bookmarkStart w:id="43" w:name="loss-counts"/>
@@ -6169,7 +6267,7 @@
           <w:color w:val="000000"/>
           <w:sz w:val="20"/>
         </w:rPr>
-        <w:t xml:space="preserve">Poisson does not survive on any of the three networks, and Table II shows why. A Poisson count has its variance equal to its mean. Ours comes out at 1.59, 5.31, 10.17 times the mean, and the dispersion test returns</w:t>
+        <w:t xml:space="preserve">None of the three networks fits the Poisson model, and Table II shows why. A Poisson distribution has its variance equal to its mean. The observed variance is 1.59, 5.31, 10.17 times the mean, and the dispersion test gives</w:t>
       </w:r>
       <w:r>
         <w:rPr>
@@ -6203,7 +6301,7 @@
           <w:color w:val="000000"/>
           <w:sz w:val="20"/>
         </w:rPr>
-        <w:t xml:space="preserve">&lt; 10⁻¹⁰ each time. The Negative Binomial does far better and has the lower AIC everywhere. Mobile shows the biggest gap, with the AIC falling from 25</w:t>
+        <w:t xml:space="preserve">&lt; 10⁻¹⁰ in each case. The Negative Binomial fits much better and has a lower AIC on all three networks. The largest gain is on Mobile, where the AIC falls from 25</w:t>
       </w:r>
       <w:r>
         <w:rPr>
@@ -6251,7 +6349,7 @@
           <w:color w:val="000000"/>
           <w:sz w:val="20"/>
         </w:rPr>
-        <w:t xml:space="preserve">Most of the difference is in the tail. Over an hour of Wi-Fi traffic, Poisson expects roughly 1.98 seconds with 5 or more losses. The trace has 131. The Negative Binomial expects 124.2, which is close. In Fig. 2, on a log scale, the Poisson curve dives almost at once while the real counts and the Negative Binomial keep going.</w:t>
+        <w:t xml:space="preserve">Most of the difference between the two models lies in the tail. For Wi-Fi, the Poisson model expects about 1.98 seconds with 5 or more losses in an hour. The trace contains 131, and the Negative Binomial expects 124.2. Fig. 2 shows this on a log scale: the Poisson curve drops away almost at once, while the observed counts and the Negative Binomial carry on further out.</w:t>
       </w:r>
     </w:p>
     <w:p>
@@ -6321,7 +6419,7 @@
           <w:color w:val="000000"/>
           <w:sz w:val="16"/>
         </w:rPr>
-        <w:t xml:space="preserve">Probability that a gap between losses is longer than</w:t>
+        <w:t xml:space="preserve">Probability that the gap between two losses is longer than</w:t>
       </w:r>
       <w:r>
         <w:rPr>
@@ -6342,7 +6440,7 @@
           <w:color w:val="000000"/>
           <w:sz w:val="16"/>
         </w:rPr>
-        <w:t xml:space="preserve">, on a log scale. An exponential gives a straight line (dashed); the two-phase mixture (green) bends with the data.</w:t>
+        <w:t xml:space="preserve">, on a log scale. The exponential fit is a straight line (dashed); the two-phase mixture (green) bends with the data.</w:t>
       </w:r>
     </w:p>
     <w:p>
@@ -7595,7 +7693,7 @@
           <w:color w:val="000000"/>
           <w:sz w:val="20"/>
         </w:rPr>
-        <w:t xml:space="preserve">The exponential does not survive either: the bootstrap KS test rejects it on every network (Table III). Fig. 3 makes the problem easy to see. Plotted on a log scale, an exponential survival curve is a straight line, and the real curves are anything but straight. They fall steeply at first, because a lot of the gaps are tiny, and then level off, because the rest are long.</w:t>
+        <w:t xml:space="preserve">The exponential model is rejected as well, with the bootstrap KS test failing it on every network (Table III). Fig. 3 makes the problem easy to see. On a log scale an exponential survival curve is a straight line, and the observed curves are not straight. They fall steeply at first, because many of the gaps are very short, and then level off, because the remaining gaps are long.</w:t>
       </w:r>
     </w:p>
     <w:p>
@@ -7611,7 +7709,7 @@
           <w:color w:val="000000"/>
           <w:sz w:val="20"/>
         </w:rPr>
-        <w:t xml:space="preserve">The two-phase mixture follows that shape well. Its fast phase has an average gap of 29 to 33 ms, only one or two packets, so these are the gaps inside a burst. The slow phase averages between 2.1 and 8.6 s, the quiet time between bursts. The fast phase holds 16% of the gaps on Wired but 77% on Mobile, which fits with the mobile link losing more of its packets in bursts. On Wired the mixture passes the KS test (</w:t>
+        <w:t xml:space="preserve">The two-phase mixture reproduces this shape well. The mean gap in its fast phase is 29 to 33 ms, one to two packets, which matches gaps inside a burst. The slow phase has a mean of 2.1 to 8.6 s and matches the quiet periods between bursts. The share of gaps in the fast phase rises from 16% on Wired to 77% on Mobile, in line with more of the mobile link’s losses falling inside bursts. The mixture passes the KS test on Wired (</w:t>
       </w:r>
       <m:oMath>
         <m:r>
@@ -7633,7 +7731,7 @@
           <w:color w:val="000000"/>
           <w:sz w:val="20"/>
         </w:rPr>
-        <w:t xml:space="preserve">), and it brings the AIC down sharply on all three. It is still rejected on Wi-Fi and Mobile, though, so it is a big step forward rather than the whole picture.</w:t>
+        <w:t xml:space="preserve">) and lowers the AIC considerably on all three networks. It is still rejected on Wi-Fi and Mobile, so it is a large improvement on the exponential but not a perfect description of the gaps.</w:t>
       </w:r>
     </w:p>
     <w:p>
@@ -8852,7 +8950,7 @@
           <w:color w:val="000000"/>
           <w:sz w:val="20"/>
         </w:rPr>
-        <w:t xml:space="preserve">They do, and strongly. Both independence tests reject</w:t>
+        <w:t xml:space="preserve">They clearly do. Both independence tests reject</w:t>
       </w:r>
       <w:r>
         <w:rPr>
@@ -8924,7 +9022,7 @@
           <w:color w:val="000000"/>
           <w:sz w:val="20"/>
         </w:rPr>
-        <w:t xml:space="preserve">&lt; 10⁻¹⁰ on every network (Table IV). On Wi-Fi we counted 3</w:t>
+        <w:t xml:space="preserve">&lt; 10⁻¹⁰ on every network (Table IV). For Wi-Fi we count 3</w:t>
       </w:r>
       <w:r>
         <w:rPr>
@@ -8940,7 +9038,7 @@
           <w:color w:val="000000"/>
           <w:sz w:val="20"/>
         </w:rPr>
-        <w:t xml:space="preserve">005 runs where independence would give about 4</w:t>
+        <w:t xml:space="preserve">005 runs, against about 4</w:t>
       </w:r>
       <w:r>
         <w:rPr>
@@ -8956,7 +9054,7 @@
           <w:color w:val="000000"/>
           <w:sz w:val="20"/>
         </w:rPr>
-        <w:t xml:space="preserve">593, a</w:t>
+        <w:t xml:space="preserve">593 expected under independence, a</w:t>
       </w:r>
       <w:r>
         <w:rPr>
@@ -8977,7 +9075,7 @@
           <w:color w:val="000000"/>
           <w:sz w:val="20"/>
         </w:rPr>
-        <w:t xml:space="preserve">-score of -146.7. The Markov estimates make it easier to picture. A Wi-Fi packet that comes after a delivered packet is lost 0.85% of the time. One that comes after a lost packet is lost 35.4% of the time.</w:t>
+        <w:t xml:space="preserve">-score of -146.7. The Markov estimates make the effect easier to picture. On Wi-Fi a packet is lost 0.85% of the time when the packet before it was delivered, but 35.4% of the time when the packet before it was lost.</w:t>
       </w:r>
     </w:p>
     <w:p>
@@ -8993,7 +9091,7 @@
           <w:color w:val="000000"/>
           <w:sz w:val="20"/>
         </w:rPr>
-        <w:t xml:space="preserve">Across Wired, Wi-Fi and Mobile, the posterior medians of</w:t>
+        <w:t xml:space="preserve">The posterior medians of</w:t>
       </w:r>
       <w:r>
         <w:rPr>
@@ -9031,7 +9129,7 @@
           <w:color w:val="000000"/>
           <w:sz w:val="20"/>
         </w:rPr>
-        <w:t xml:space="preserve">are 43, 42, 31, so a single loss makes the next one 31 to 43 times more likely (Fig. 4). The posterior probability that b &gt; a is 1.000 on every network, which leaves no real doubt about the direction. Bursts are short on average, 1.12, 1.55, 2.25 packets, but they turn up far more often than chance would allow.</w:t>
+        <w:t xml:space="preserve">are 43, 42, 31 for Wired, Wi-Fi and Mobile, so a single loss makes the next loss 31 to 43 times more likely (Fig. 4). The posterior probability that b &gt; a is 1.000 on every network, so the direction of the effect is not in doubt. The average bursts are short, at 1.12, 1.55, 2.25 packets, but they happen far more often than they would by chance.</w:t>
       </w:r>
     </w:p>
     <w:p>
@@ -9203,7 +9301,7 @@
           <w:color w:val="000000"/>
           <w:sz w:val="16"/>
         </w:rPr>
-        <w:t xml:space="preserve">(filled). On every network a loss makes the next loss far more likely.</w:t>
+        <w:t xml:space="preserve">(filled). On all three networks a loss sharply raises the chance that the next packet is lost too.</w:t>
       </w:r>
     </w:p>
     <w:p>
@@ -10543,7 +10641,7 @@
           <w:color w:val="000000"/>
           <w:sz w:val="20"/>
         </w:rPr>
-        <w:t xml:space="preserve">The three networks are clearly different, which is reassuring given that we built them to be. The Kruskal-Wallis statistic is</w:t>
+        <w:t xml:space="preserve">The three networks differ clearly, as expected from how they were set up. The Kruskal-Wallis statistic is</w:t>
       </w:r>
       <w:r>
         <w:rPr>
@@ -10627,7 +10725,7 @@
           <w:color w:val="000000"/>
           <w:sz w:val="20"/>
         </w:rPr>
-        <w:t xml:space="preserve">143.0 on 2 degrees of freedom, and even the largest Bonferroni-corrected pairwise p-value is &lt; 10⁻¹⁰. The posterior mean loss rates are 0.276%, 1.293%, 3.938% (Table V), and the posterior probability of the order Wired &lt; Wi-Fi &lt; Mobile is 1.000.</w:t>
+        <w:t xml:space="preserve">143.0 on 2 degrees of freedom, and even the largest Bonferroni-corrected pairwise p-value is &lt; 10⁻¹⁰. The posterior mean loss rates are 0.276%, 1.293%, 3.938% (Table V), and the posterior probability of the ordering Wired &lt; Wi-Fi &lt; Mobile is 1.000.</w:t>
       </w:r>
     </w:p>
     <w:p>
@@ -10643,7 +10741,7 @@
           <w:color w:val="000000"/>
           <w:sz w:val="20"/>
         </w:rPr>
-        <w:t xml:space="preserve">Fig. 5 shows the Bayesian estimates. After just 10 s of Campus Wi-Fi traffic the estimate is 3.78% [2.30%, 5.62%], which is wide. By 3</w:t>
+        <w:t xml:space="preserve">Fig. 5 shows the Bayesian estimates. With only 10 s of Campus Wi-Fi traffic the estimate is 3.78% [2.30%, 5.62%], a wide interval. After 3</w:t>
       </w:r>
       <w:r>
         <w:rPr>
@@ -10675,7 +10773,7 @@
           <w:color w:val="000000"/>
           <w:sz w:val="20"/>
         </w:rPr>
-        <w:t xml:space="preserve">The predictive check shows how badly the independent model handles heavy seconds. For Wi-Fi it puts the chance of a second with 5 or more losses at 0.00047. In the trace that happens 0.036 of the time, about 77 times as often.</w:t>
+        <w:t xml:space="preserve">The predictive check shows how poorly the independent model handles seconds with many losses. For Wi-Fi it puts the probability of a second with at least 5 losses at 0.00047. In the trace such seconds make up 0.036 of the total, about 77 times as often as predicted.</w:t>
       </w:r>
     </w:p>
     <w:bookmarkEnd w:id="52"/>
@@ -10708,7 +10806,7 @@
           <w:color w:val="000000"/>
           <w:sz w:val="20"/>
         </w:rPr>
-        <w:t xml:space="preserve">For us this is the result that matters most. Over 2</w:t>
+        <w:t xml:space="preserve">For us this is the key result. Across 2</w:t>
       </w:r>
       <w:r>
         <w:rPr>
@@ -10724,7 +10822,7 @@
           <w:color w:val="000000"/>
           <w:sz w:val="20"/>
         </w:rPr>
-        <w:t xml:space="preserve">000 simulated 10-minute captures, the naive 95% interval held the true loss rate in just 85.7%, 60.9%, 40.3% of cases (Table V, Fig. 6). On the burstiest network it missed more often than it hit.</w:t>
+        <w:t xml:space="preserve">000 simulated 10-minute captures, the naive 95% interval included the true loss rate in only 85.7%, 60.9%, 40.3% of cases (Table V, Fig. 6). On the burstiest network it missed the true value more often than it caught it.</w:t>
       </w:r>
     </w:p>
     <w:p>
@@ -10794,7 +10892,7 @@
           <w:color w:val="000000"/>
           <w:sz w:val="16"/>
         </w:rPr>
-        <w:t xml:space="preserve">How often the nominal 95% interval contains the true loss rate, before and after the design-effect correction.</w:t>
+        <w:t xml:space="preserve">Share of nominal 95% intervals that contain the true loss rate, before and after the design-effect correction.</w:t>
       </w:r>
     </w:p>
     <w:p>
@@ -10864,7 +10962,7 @@
           <w:color w:val="000000"/>
           <w:sz w:val="16"/>
         </w:rPr>
-        <w:t xml:space="preserve">Power to detect dependence against capture length, from 2</w:t>
+        <w:t xml:space="preserve">Power to detect dependence as capture length grows, from 2</w:t>
       </w:r>
       <w:r>
         <w:rPr>
@@ -10896,7 +10994,7 @@
           <w:color w:val="000000"/>
           <w:sz w:val="20"/>
         </w:rPr>
-        <w:t xml:space="preserve">The design effects come out at 1.52, 6.43 and 12.14. For Wi-Fi, that means our 180</w:t>
+        <w:t xml:space="preserve">The design effects are 1.52, 6.43 and 12.14. For Wi-Fi, this means our 180</w:t>
       </w:r>
       <w:r>
         <w:rPr>
@@ -10912,7 +11010,7 @@
           <w:color w:val="000000"/>
           <w:sz w:val="20"/>
         </w:rPr>
-        <w:t xml:space="preserve">000 packets carry about as much information as 28</w:t>
+        <w:t xml:space="preserve">000 packets hold roughly the same information as 28</w:t>
       </w:r>
       <w:r>
         <w:rPr>
@@ -10928,7 +11026,7 @@
           <w:color w:val="000000"/>
           <w:sz w:val="20"/>
         </w:rPr>
-        <w:t xml:space="preserve">000 independent ones would. Once we use these smaller effective sample sizes, coverage climbs back to 93.3%, 94.0%, 94.0%, close to the 95% it is supposed to be. The cost is a wider interval: on Wi-Fi the average width goes from 0.245 to 0.563 percentage points. We think that is a fair trade, since a narrow interval that misses the truth is not much use to anyone.</w:t>
+        <w:t xml:space="preserve">000 independent packets would. With these smaller effective sample sizes, coverage returns to 93.3%, 94.0%, 94.0%, close to the intended 95%. The intervals do get wider; on Wi-Fi the average width grows from 0.245 to 0.563 percentage points. We think that is worth it for intervals that contain the true value about as often as they claim to.</w:t>
       </w:r>
     </w:p>
     <w:p>
@@ -10944,7 +11042,7 @@
           <w:color w:val="000000"/>
           <w:sz w:val="20"/>
         </w:rPr>
-        <w:t xml:space="preserve">The full Wi-Fi trace makes this concrete. The true loss rate there is 1.184%. The naive interval, [1.241%, 1.345%], misses it entirely; the adjusted one, [1.167%, 1.431%], does not.</w:t>
+        <w:t xml:space="preserve">The full Wi-Fi trace is a good example. Its true loss rate is 1.184%. The naive interval of [1.241%, 1.345%] lies entirely above this value, while the adjusted interval of [1.167%, 1.431%] contains it.</w:t>
       </w:r>
     </w:p>
     <w:p>
@@ -11797,7 +11895,41 @@
           <w:color w:val="000000"/>
           <w:sz w:val="20"/>
         </w:rPr>
-        <w:t xml:space="preserve">Fig. 7 shows each test’s power rising as captures get longer, and Table VI lists the shortest length we tried that reaches a power of 0.8. With the runs test, Mobile needs only 15 s and Wi-Fi 30 s. Wired needs 300 s: its bursts are rare and short, so evidence builds up slowly. The runs test was the most powerful of the three on every network. At 600 s, every test reaches a power of at least 0.97 everywhere, which is why we plan to record at least ten minutes per network in Phase 2.</w:t>
+        <w:t xml:space="preserve">Fig. 7 shows how the power of each test increases with capture length, and Table VI lists the shortest length we tried at which power reaches 0.8. With the runs test, the mobile network needs only 15 s and Wi-Fi 30 s. Wired needs 300 s, since its bursts are infrequent and short and evidence takes longer to build up. The runs test was the most powerful of the three on every network. At 600 s every test has a power of at least 0.97 on every network, which is why we plan to record at least ten minutes per network in Phase 2.</w:t>
+      </w:r>
+    </w:p>
+    <w:bookmarkEnd w:id="60"/>
+    <w:bookmarkEnd w:id="61"/>
+    <w:bookmarkStart w:id="62" w:name="discussion-and-limitations"/>
+    <w:p>
+      <w:pPr>
+        <w:spacing w:before="160" w:after="80" w:line="240" w:lineRule="auto"/>
+        <w:jc w:val="center"/>
+      </w:pPr>
+      <w:r>
+        <w:rPr>
+          <w:rFonts w:ascii="Times New Roman" w:hAnsi="Times New Roman" w:cs="Times New Roman" w:eastAsia="Times New Roman"/>
+          <w:smallCaps/>
+          <w:color w:val="000000"/>
+          <w:sz w:val="20"/>
+        </w:rPr>
+        <w:t>VI. Discussion and Limitations</w:t>
+      </w:r>
+    </w:p>
+    <w:p>
+      <w:pPr>
+        <w:pStyle w:val="FirstParagraph"/>
+        <w:spacing w:before="0" w:after="0" w:line="240" w:lineRule="auto"/>
+        <w:ind w:firstLine="202"/>
+        <w:jc w:val="both"/>
+      </w:pPr>
+      <w:r>
+        <w:rPr>
+          <w:rFonts w:ascii="Times New Roman" w:hAnsi="Times New Roman" w:cs="Times New Roman" w:eastAsia="Times New Roman"/>
+          <w:color w:val="000000"/>
+          <w:sz w:val="20"/>
+        </w:rPr>
+        <w:t xml:space="preserve">It takes surprisingly little for independence to fail. A Bad spell of only a few packets is enough to break every model built on that assumption, and the loss rate alone gives no hint of it. Mobile loses roughly 14 times as many packets as Wired, yet on both networks a loss makes another loss tens of times more likely. Burstiness is a separate property of a link and has to be measured separately.</w:t>
       </w:r>
     </w:p>
     <w:p>
@@ -12382,9 +12514,56 @@
         </w:tc>
       </w:tr>
     </w:tbl>
-    <w:bookmarkEnd w:id="60"/>
-    <w:bookmarkEnd w:id="61"/>
-    <w:bookmarkStart w:id="62" w:name="discussion-and-limitations"/>
+    <w:p>
+      <w:pPr>
+        <w:pStyle w:val="BodyText"/>
+        <w:spacing w:before="0" w:after="0" w:line="240" w:lineRule="auto"/>
+        <w:ind w:firstLine="202"/>
+        <w:jc w:val="both"/>
+      </w:pPr>
+      <w:r>
+        <w:rPr>
+          <w:rFonts w:ascii="Times New Roman" w:hAnsi="Times New Roman" w:cs="Times New Roman" w:eastAsia="Times New Roman"/>
+          <w:color w:val="000000"/>
+          <w:sz w:val="20"/>
+        </w:rPr>
+        <w:t xml:space="preserve">The coverage results show the problem is bigger than picking the right model. A naive interval counts every packet as a new and independent piece of evidence. When packets within a burst share the same outcome, there is much less independent evidence than the packet count suggests, and the interval turns out too narrow. The effect grows as the network becomes burstier, which is why Mobile has the lowest naive coverage. The design-effect correction is simple, needs only block counts, and brings coverage close to 95% on all three networks.</w:t>
+      </w:r>
+    </w:p>
+    <w:p>
+      <w:pPr>
+        <w:pStyle w:val="BodyText"/>
+        <w:spacing w:before="0" w:after="0" w:line="240" w:lineRule="auto"/>
+        <w:ind w:firstLine="202"/>
+        <w:jc w:val="both"/>
+      </w:pPr>
+      <w:r>
+        <w:rPr>
+          <w:rFonts w:ascii="Times New Roman" w:hAnsi="Times New Roman" w:cs="Times New Roman" w:eastAsia="Times New Roman"/>
+          <w:color w:val="000000"/>
+          <w:sz w:val="20"/>
+        </w:rPr>
+        <w:t xml:space="preserve">There are limits to what we can claim. The main one is that the data are simulated, and from the same kind of model that motivated the study. The tests do not use this, and the true parameters are only used to judge the estimates, but real links have other effects, such as busy hours, that our model leaves out. Phase 2 is meant to deal with this.</w:t>
+      </w:r>
+    </w:p>
+    <w:p>
+      <w:pPr>
+        <w:pStyle w:val="BodyText"/>
+        <w:spacing w:before="0" w:after="0" w:line="240" w:lineRule="auto"/>
+        <w:ind w:firstLine="202"/>
+        <w:jc w:val="both"/>
+      </w:pPr>
+      <w:r>
+        <w:rPr>
+          <w:rFonts w:ascii="Times New Roman" w:hAnsi="Times New Roman" w:cs="Times New Roman" w:eastAsia="Times New Roman"/>
+          <w:color w:val="000000"/>
+          <w:sz w:val="20"/>
+        </w:rPr>
+        <w:t xml:space="preserve">There are also a few smaller points. The dispersion test compares the counts with a Poisson distribution, but counts out of 50 packets are really Binomial, with a variance slightly below the mean. This makes the test a little conservative, so it is more likely to understate burstiness than to overstate it. The runs and Markov tests rely on large-sample approximations. In very short captures their false-alarm rate may drift from 5%, although for hour-long traces it stays close to 5%. The Negative Binomial and the two-phase mixture are both still rejected on Wi-Fi and Mobile, so neither gives a complete description. The design effect depends on the block length we choose, and our 10-s blocks are much longer than any Bad spell, which should be enough. Finally, the headline figures come from one seeded trace per network, although the Monte Carlo checks repeat the whole experiment thousands of times.</w:t>
+      </w:r>
+    </w:p>
+    <w:bookmarkEnd w:id="62"/>
+    <w:bookmarkStart w:id="63" w:name="conclusion-and-future-work"/>
     <w:p>
       <w:pPr>
         <w:spacing w:before="160" w:after="80" w:line="240" w:lineRule="auto"/>
@@ -12397,7 +12576,7 @@
           <w:color w:val="000000"/>
           <w:sz w:val="20"/>
         </w:rPr>
-        <w:t>VI. Discussion and Limitations</w:t>
+        <w:t>VII. Conclusion and Future Work</w:t>
       </w:r>
     </w:p>
     <w:p>
@@ -12413,7 +12592,7 @@
           <w:color w:val="000000"/>
           <w:sz w:val="20"/>
         </w:rPr>
-        <w:t xml:space="preserve">The striking thing is how little it takes. A Bad spell of a few packets is enough to break every model that assumes independence, and the loss rate on its own gives no hint of it. Mobile loses about 14 times as many packets as Wired, yet on both of them one loss makes the next tens of times more likely. Burstiness is its own property of a link and needs to be measured on its own.</w:t>
+        <w:t xml:space="preserve">We tested whether packet losses on three simulated networks behave independently, and found that they do not. The Poisson and exponential models were rejected in every case. The per-second loss counts were 1.59, 5.31, 10.17 times more spread out than a Poisson model allows, the gaps split into short gaps within bursts and long quiet gaps between them, and each loss made the next one 31 to 43 times more likely. Most importantly, the standard 95% interval for the loss rate was right in only 40.3% to 85.7% of cases. Dividing the sample size by the design effect raised this to between 93.3% and 94.0%.</w:t>
       </w:r>
     </w:p>
     <w:p>
@@ -12429,43 +12608,11 @@
           <w:color w:val="000000"/>
           <w:sz w:val="20"/>
         </w:rPr>
-        <w:t xml:space="preserve">The coverage results take this past model choice. A naive interval treats every packet as a new, independent piece of evidence. When packets in a burst share the same fate, there is much less independent evidence than the packet count suggests, and the interval ends up too tight. The burstier the network, the worse this gets, which is why Mobile has the lowest naive coverage. The design-effect fix is cheap (all it needs is block counts) and brings coverage close to 95% on all three networks.</w:t>
+        <w:t xml:space="preserve">The next step is Phase 2. We will record steady streams of 50 packets per second on real wired, Wi-Fi and mobile links, for at least ten minutes each, and run the same code on them. After that we would like to estimate the Gilbert-Elliott parameters directly from the real traces using the Baum-Welch algorithm, try richer models for the tail, use the Phase 1 results as priors in a hierarchical Bayesian model across the networks, and compare loss at peak and off-peak hours.</w:t>
       </w:r>
     </w:p>
-    <w:p>
-      <w:pPr>
-        <w:pStyle w:val="BodyText"/>
-        <w:spacing w:before="0" w:after="0" w:line="240" w:lineRule="auto"/>
-        <w:ind w:firstLine="202"/>
-        <w:jc w:val="both"/>
-      </w:pPr>
-      <w:r>
-        <w:rPr>
-          <w:rFonts w:ascii="Times New Roman" w:hAnsi="Times New Roman" w:cs="Times New Roman" w:eastAsia="Times New Roman"/>
-          <w:color w:val="000000"/>
-          <w:sz w:val="20"/>
-        </w:rPr>
-        <w:t xml:space="preserve">There are clear limits to what we can claim. The biggest one is that the data are simulated, and from the very kind of model that motivated the study. The tests do not use this, and we only use the true parameters to judge the estimates, but real links have effects our model leaves out, busy hours being the obvious one. That is what Phase 2 is for.</w:t>
-      </w:r>
-    </w:p>
-    <w:p>
-      <w:pPr>
-        <w:pStyle w:val="BodyText"/>
-        <w:spacing w:before="0" w:after="0" w:line="240" w:lineRule="auto"/>
-        <w:ind w:firstLine="202"/>
-        <w:jc w:val="both"/>
-      </w:pPr>
-      <w:r>
-        <w:rPr>
-          <w:rFonts w:ascii="Times New Roman" w:hAnsi="Times New Roman" w:cs="Times New Roman" w:eastAsia="Times New Roman"/>
-          <w:color w:val="000000"/>
-          <w:sz w:val="20"/>
-        </w:rPr>
-        <w:t xml:space="preserve">A few smaller points. The dispersion test compares the counts with a Poisson, but counts out of 50 packets are strictly Binomial, with a variance a little under the mean. That makes the test slightly conservative, so if anything it understates burstiness. The runs and Markov tests rely on large-sample approximations. In very short captures their false-alarm rate can move away from 5%, though on hour-long traces it stays close. The Negative Binomial and the two-phase mixture are both still rejected on Wi-Fi and Mobile, so neither is the full story. The design effect depends on the block length; ours is 10 s, much longer than any Bad spell, which should be enough. Last, the headline numbers come from a single seeded trace per network, although the Monte Carlo checks repeat the whole experiment thousands of times.</w:t>
-      </w:r>
-    </w:p>
-    <w:bookmarkEnd w:id="62"/>
-    <w:bookmarkStart w:id="63" w:name="conclusion-and-future-work"/>
+    <w:bookmarkEnd w:id="63"/>
+    <w:bookmarkStart w:id="64" w:name="reproducibility"/>
     <w:p>
       <w:pPr>
         <w:spacing w:before="160" w:after="80" w:line="240" w:lineRule="auto"/>
@@ -12478,7 +12625,7 @@
           <w:color w:val="000000"/>
           <w:sz w:val="20"/>
         </w:rPr>
-        <w:t>VII. Conclusion and Future Work</w:t>
+        <w:t>Reproducibility</w:t>
       </w:r>
     </w:p>
     <w:p>
@@ -12494,56 +12641,7 @@
           <w:color w:val="000000"/>
           <w:sz w:val="20"/>
         </w:rPr>
-        <w:t xml:space="preserve">We set out to test whether packet losses on three simulated networks behave independently. They do not. Poisson and exponential models were rejected everywhere. Losses per second were 1.59, 5.31, 10.17 times more spread out than a Poisson allows, the gaps split into short in-burst gaps and long quiet ones, and one loss made the next 31 to 43 times more likely. The finding we would stress most is about the error bars: the usual 95% interval for the loss rate was right only 40.3% to 85.7% of the time, and dividing the sample size by the design effect lifted that to 93.3% to 94.0%.</w:t>
-      </w:r>
-    </w:p>
-    <w:p>
-      <w:pPr>
-        <w:pStyle w:val="BodyText"/>
-        <w:spacing w:before="0" w:after="0" w:line="240" w:lineRule="auto"/>
-        <w:ind w:firstLine="202"/>
-        <w:jc w:val="both"/>
-      </w:pPr>
-      <w:r>
-        <w:rPr>
-          <w:rFonts w:ascii="Times New Roman" w:hAnsi="Times New Roman" w:cs="Times New Roman" w:eastAsia="Times New Roman"/>
-          <w:color w:val="000000"/>
-          <w:sz w:val="20"/>
-        </w:rPr>
-        <w:t xml:space="preserve">Phase 2 comes next. We will record steady streams of 50 packets a second on real wired, Wi-Fi and mobile links, at least ten minutes each, and run the same code on them. After that, there are a few things we would like to try: estimating the Gilbert-Elliott parameters straight from the real traces with the Baum-Welch algorithm, fitting richer models to the tail, using the Phase 1 results as priors in a hierarchical Bayesian model that pools the networks, and comparing loss at peak and off-peak hours.</w:t>
-      </w:r>
-    </w:p>
-    <w:bookmarkEnd w:id="63"/>
-    <w:bookmarkStart w:id="64" w:name="reproducibility"/>
-    <w:p>
-      <w:pPr>
-        <w:spacing w:before="160" w:after="80" w:line="240" w:lineRule="auto"/>
-        <w:jc w:val="center"/>
-      </w:pPr>
-      <w:r>
-        <w:rPr>
-          <w:rFonts w:ascii="Times New Roman" w:hAnsi="Times New Roman" w:cs="Times New Roman" w:eastAsia="Times New Roman"/>
-          <w:smallCaps/>
-          <w:color w:val="000000"/>
-          <w:sz w:val="20"/>
-        </w:rPr>
-        <w:t>Reproducibility</w:t>
-      </w:r>
-    </w:p>
-    <w:p>
-      <w:pPr>
-        <w:pStyle w:val="FirstParagraph"/>
-        <w:spacing w:before="0" w:after="0" w:line="240" w:lineRule="auto"/>
-        <w:ind w:firstLine="202"/>
-        <w:jc w:val="both"/>
-      </w:pPr>
-      <w:r>
-        <w:rPr>
-          <w:rFonts w:ascii="Times New Roman" w:hAnsi="Times New Roman" w:cs="Times New Roman" w:eastAsia="Times New Roman"/>
-          <w:color w:val="000000"/>
-          <w:sz w:val="20"/>
-        </w:rPr>
-        <w:t xml:space="preserve">Everything in this report comes from one Python pipeline, built on NumPy, SciPy and Matplotlib and run with seed 2026. Running it again reproduces every table and figure.</w:t>
+        <w:t xml:space="preserve">Every result in this report was produced by one Python pipeline, built on NumPy, SciPy and Matplotlib and run with seed 2026. Running it again regenerates all of the tables and figures.</w:t>
       </w:r>
     </w:p>
     <w:bookmarkEnd w:id="64"/>

</xml_diff>